<commit_message>
ER RISTRUTTURATO E PROG LOGICA
</commit_message>
<xml_diff>
--- a/doc/documentazioneFinale/BD2526-Seduta-Iosso_La Mura_FINALE.docx
+++ b/doc/documentazioneFinale/BD2526-Seduta-Iosso_La Mura_FINALE.docx
@@ -2391,7 +2391,15 @@
           <w:rFonts w:cs="Times New Roman"/>
           <w:szCs w:val="20"/>
         </w:rPr>
-        <w:t>Visto che anche qui una chiave “naturale” sarebbe molto ingombrante, si ricorre anche qui ad una chiave primaria</w:t>
+        <w:t xml:space="preserve">Visto che anche qui una chiave “naturale” sarebbe molto ingombrante, si ricorre anche qui ad una chiave </w:t>
+      </w:r>
+      <w:proofErr w:type="gramStart"/>
+      <w:r>
+        <w:rPr>
+          <w:rFonts w:cs="Times New Roman"/>
+          <w:szCs w:val="20"/>
+        </w:rPr>
+        <w:t>primaria</w:t>
       </w:r>
       <w:r>
         <w:rPr>
@@ -2400,6 +2408,917 @@
         </w:rPr>
         <w:t xml:space="preserve"> .</w:t>
       </w:r>
+      <w:proofErr w:type="gramEnd"/>
+    </w:p>
+    <w:p>
+      <w:pPr>
+        <w:ind w:left="0" w:right="192" w:firstLine="0"/>
+        <w:rPr>
+          <w:rFonts w:cs="Times New Roman"/>
+          <w:szCs w:val="20"/>
+        </w:rPr>
+      </w:pPr>
+    </w:p>
+    <w:p>
+      <w:pPr>
+        <w:ind w:left="0" w:right="192" w:firstLine="0"/>
+        <w:jc w:val="center"/>
+        <w:rPr>
+          <w:rFonts w:cs="Times New Roman"/>
+          <w:b/>
+          <w:bCs/>
+          <w:sz w:val="29"/>
+          <w:szCs w:val="29"/>
+        </w:rPr>
+      </w:pPr>
+    </w:p>
+    <w:p>
+      <w:pPr>
+        <w:ind w:left="0" w:right="192" w:firstLine="0"/>
+        <w:jc w:val="center"/>
+        <w:rPr>
+          <w:rFonts w:cs="Times New Roman"/>
+          <w:b/>
+          <w:bCs/>
+          <w:sz w:val="29"/>
+          <w:szCs w:val="29"/>
+        </w:rPr>
+      </w:pPr>
+      <w:r>
+        <w:rPr>
+          <w:rFonts w:cs="Times New Roman"/>
+          <w:b/>
+          <w:bCs/>
+          <w:sz w:val="29"/>
+          <w:szCs w:val="29"/>
+        </w:rPr>
+        <w:lastRenderedPageBreak/>
+        <w:t>4 Progettazione Logica</w:t>
+      </w:r>
+    </w:p>
+    <w:p>
+      <w:pPr>
+        <w:ind w:left="0" w:right="192" w:firstLine="0"/>
+        <w:jc w:val="center"/>
+        <w:rPr>
+          <w:rFonts w:cs="Times New Roman"/>
+          <w:b/>
+          <w:bCs/>
+          <w:sz w:val="29"/>
+          <w:szCs w:val="29"/>
+        </w:rPr>
+      </w:pPr>
+    </w:p>
+    <w:p>
+      <w:pPr>
+        <w:ind w:left="0" w:right="192" w:firstLine="0"/>
+        <w:jc w:val="left"/>
+        <w:rPr>
+          <w:rFonts w:cs="Times New Roman"/>
+          <w:sz w:val="24"/>
+        </w:rPr>
+      </w:pPr>
+      <w:proofErr w:type="gramStart"/>
+      <w:r>
+        <w:rPr>
+          <w:rFonts w:cs="Times New Roman"/>
+          <w:sz w:val="24"/>
+        </w:rPr>
+        <w:t>STUDENTE(</w:t>
+      </w:r>
+      <w:proofErr w:type="gramEnd"/>
+      <w:r>
+        <w:rPr>
+          <w:rFonts w:cs="Times New Roman"/>
+          <w:b/>
+          <w:bCs/>
+          <w:sz w:val="24"/>
+        </w:rPr>
+        <w:t>Login</w:t>
+      </w:r>
+      <w:r>
+        <w:rPr>
+          <w:rFonts w:cs="Times New Roman"/>
+          <w:sz w:val="24"/>
+        </w:rPr>
+        <w:t xml:space="preserve">, Password, Nome, Cognome, </w:t>
+      </w:r>
+      <w:proofErr w:type="gramStart"/>
+      <w:r>
+        <w:rPr>
+          <w:rFonts w:cs="Times New Roman"/>
+          <w:sz w:val="24"/>
+        </w:rPr>
+        <w:t>Email</w:t>
+      </w:r>
+      <w:proofErr w:type="gramEnd"/>
+      <w:r>
+        <w:rPr>
+          <w:rFonts w:cs="Times New Roman"/>
+          <w:sz w:val="24"/>
+        </w:rPr>
+        <w:t>, Matricola, Stato)</w:t>
+      </w:r>
+      <w:r>
+        <w:rPr>
+          <w:rFonts w:cs="Times New Roman"/>
+          <w:sz w:val="24"/>
+        </w:rPr>
+        <w:t>;</w:t>
+      </w:r>
+    </w:p>
+    <w:p>
+      <w:pPr>
+        <w:ind w:left="0" w:right="192" w:firstLine="0"/>
+        <w:jc w:val="left"/>
+        <w:rPr>
+          <w:rFonts w:cs="Times New Roman"/>
+          <w:sz w:val="24"/>
+        </w:rPr>
+      </w:pPr>
+      <w:proofErr w:type="gramStart"/>
+      <w:r>
+        <w:rPr>
+          <w:rFonts w:cs="Times New Roman"/>
+          <w:sz w:val="24"/>
+        </w:rPr>
+        <w:t>DOCENTE(</w:t>
+      </w:r>
+      <w:proofErr w:type="gramEnd"/>
+      <w:r>
+        <w:rPr>
+          <w:rFonts w:cs="Times New Roman"/>
+          <w:b/>
+          <w:bCs/>
+          <w:sz w:val="24"/>
+        </w:rPr>
+        <w:t>Login</w:t>
+      </w:r>
+      <w:r>
+        <w:rPr>
+          <w:rFonts w:cs="Times New Roman"/>
+          <w:sz w:val="24"/>
+        </w:rPr>
+        <w:t xml:space="preserve">, Password, Nome, Cognome, </w:t>
+      </w:r>
+      <w:proofErr w:type="gramStart"/>
+      <w:r>
+        <w:rPr>
+          <w:rFonts w:cs="Times New Roman"/>
+          <w:sz w:val="24"/>
+        </w:rPr>
+        <w:t>Email</w:t>
+      </w:r>
+      <w:proofErr w:type="gramEnd"/>
+      <w:r>
+        <w:rPr>
+          <w:rFonts w:cs="Times New Roman"/>
+          <w:sz w:val="24"/>
+        </w:rPr>
+        <w:t>, Matricola, Stato)</w:t>
+      </w:r>
+      <w:r>
+        <w:rPr>
+          <w:rFonts w:cs="Times New Roman"/>
+          <w:sz w:val="24"/>
+        </w:rPr>
+        <w:t>;</w:t>
+      </w:r>
+    </w:p>
+    <w:p>
+      <w:pPr>
+        <w:ind w:left="0" w:right="192" w:firstLine="0"/>
+        <w:jc w:val="left"/>
+        <w:rPr>
+          <w:rFonts w:cs="Times New Roman"/>
+          <w:sz w:val="24"/>
+        </w:rPr>
+      </w:pPr>
+      <w:proofErr w:type="gramStart"/>
+      <w:r>
+        <w:rPr>
+          <w:rFonts w:cs="Times New Roman"/>
+          <w:sz w:val="24"/>
+        </w:rPr>
+        <w:t>TIROCINIO</w:t>
+      </w:r>
+      <w:r>
+        <w:rPr>
+          <w:rFonts w:cs="Times New Roman"/>
+          <w:sz w:val="24"/>
+        </w:rPr>
+        <w:t>(</w:t>
+      </w:r>
+      <w:proofErr w:type="spellStart"/>
+      <w:proofErr w:type="gramEnd"/>
+      <w:r>
+        <w:rPr>
+          <w:rFonts w:cs="Times New Roman"/>
+          <w:b/>
+          <w:bCs/>
+          <w:sz w:val="24"/>
+        </w:rPr>
+        <w:t>ID_Ti</w:t>
+      </w:r>
+      <w:proofErr w:type="spellEnd"/>
+      <w:r>
+        <w:rPr>
+          <w:rFonts w:cs="Times New Roman"/>
+          <w:sz w:val="24"/>
+        </w:rPr>
+        <w:t>,</w:t>
+      </w:r>
+      <w:r>
+        <w:rPr>
+          <w:rFonts w:cs="Times New Roman"/>
+          <w:sz w:val="24"/>
+        </w:rPr>
+        <w:t xml:space="preserve"> Descrizione, Nome, Data, </w:t>
+      </w:r>
+      <w:r>
+        <w:rPr>
+          <w:rFonts w:cs="Times New Roman"/>
+          <w:i/>
+          <w:iCs/>
+          <w:sz w:val="24"/>
+        </w:rPr>
+        <w:t>Login^</w:t>
+      </w:r>
+      <w:r>
+        <w:rPr>
+          <w:rFonts w:cs="Times New Roman"/>
+          <w:sz w:val="24"/>
+        </w:rPr>
+        <w:t>)</w:t>
+      </w:r>
+      <w:r>
+        <w:rPr>
+          <w:rFonts w:cs="Times New Roman"/>
+          <w:sz w:val="24"/>
+        </w:rPr>
+        <w:t>;</w:t>
+      </w:r>
+    </w:p>
+    <w:p>
+      <w:pPr>
+        <w:ind w:left="0" w:right="192" w:firstLine="0"/>
+        <w:jc w:val="left"/>
+        <w:rPr>
+          <w:rFonts w:cs="Times New Roman"/>
+          <w:sz w:val="24"/>
+        </w:rPr>
+      </w:pPr>
+      <w:proofErr w:type="spellStart"/>
+      <w:r>
+        <w:rPr>
+          <w:rFonts w:cs="Times New Roman"/>
+          <w:sz w:val="24"/>
+        </w:rPr>
+        <w:t>TIROCINIO.Login</w:t>
+      </w:r>
+      <w:proofErr w:type="spellEnd"/>
+      <w:r>
+        <w:rPr>
+          <w:rFonts w:cs="Times New Roman"/>
+          <w:sz w:val="24"/>
+        </w:rPr>
+        <w:t xml:space="preserve"> = </w:t>
+      </w:r>
+      <w:proofErr w:type="spellStart"/>
+      <w:r>
+        <w:rPr>
+          <w:rFonts w:cs="Times New Roman"/>
+          <w:sz w:val="24"/>
+        </w:rPr>
+        <w:t>DOCENTE.</w:t>
+      </w:r>
+      <w:r>
+        <w:rPr>
+          <w:rFonts w:cs="Times New Roman"/>
+          <w:sz w:val="24"/>
+        </w:rPr>
+        <w:t>Login</w:t>
+      </w:r>
+      <w:proofErr w:type="spellEnd"/>
+      <w:r>
+        <w:rPr>
+          <w:rFonts w:cs="Times New Roman"/>
+          <w:sz w:val="24"/>
+        </w:rPr>
+        <w:t>;</w:t>
+      </w:r>
+    </w:p>
+    <w:p>
+      <w:pPr>
+        <w:ind w:left="0" w:right="192" w:firstLine="0"/>
+        <w:jc w:val="left"/>
+        <w:rPr>
+          <w:rFonts w:cs="Times New Roman"/>
+          <w:sz w:val="24"/>
+        </w:rPr>
+      </w:pPr>
+      <w:proofErr w:type="gramStart"/>
+      <w:r>
+        <w:rPr>
+          <w:rFonts w:cs="Times New Roman"/>
+          <w:sz w:val="24"/>
+        </w:rPr>
+        <w:t>TIROCINIOESTERNO(</w:t>
+      </w:r>
+      <w:proofErr w:type="spellStart"/>
+      <w:proofErr w:type="gramEnd"/>
+      <w:r>
+        <w:rPr>
+          <w:rFonts w:cs="Times New Roman"/>
+          <w:b/>
+          <w:bCs/>
+          <w:sz w:val="24"/>
+        </w:rPr>
+        <w:t>ID_TiEs</w:t>
+      </w:r>
+      <w:proofErr w:type="spellEnd"/>
+      <w:r>
+        <w:rPr>
+          <w:rFonts w:cs="Times New Roman"/>
+          <w:sz w:val="24"/>
+        </w:rPr>
+        <w:t xml:space="preserve">, </w:t>
+      </w:r>
+      <w:proofErr w:type="spellStart"/>
+      <w:r>
+        <w:rPr>
+          <w:rFonts w:cs="Times New Roman"/>
+          <w:sz w:val="24"/>
+        </w:rPr>
+        <w:t>NomeAzienda</w:t>
+      </w:r>
+      <w:proofErr w:type="spellEnd"/>
+      <w:r>
+        <w:rPr>
+          <w:rFonts w:cs="Times New Roman"/>
+          <w:sz w:val="24"/>
+        </w:rPr>
+        <w:t xml:space="preserve">, Referente, </w:t>
+      </w:r>
+      <w:r>
+        <w:rPr>
+          <w:rFonts w:cs="Times New Roman"/>
+          <w:i/>
+          <w:iCs/>
+          <w:sz w:val="24"/>
+        </w:rPr>
+        <w:t>ID_TI</w:t>
+      </w:r>
+      <w:r>
+        <w:rPr>
+          <w:rFonts w:cs="Times New Roman"/>
+          <w:sz w:val="24"/>
+        </w:rPr>
+        <w:t>^);</w:t>
+      </w:r>
+      <w:r>
+        <w:rPr>
+          <w:rFonts w:cs="Times New Roman"/>
+          <w:sz w:val="24"/>
+        </w:rPr>
+        <w:br/>
+        <w:t>TIROCINIOESTERNO.ID_TI</w:t>
+      </w:r>
+      <w:r>
+        <w:rPr>
+          <w:rFonts w:cs="Times New Roman"/>
+          <w:sz w:val="24"/>
+        </w:rPr>
+        <w:t xml:space="preserve"> </w:t>
+      </w:r>
+      <w:r>
+        <w:rPr>
+          <w:rFonts w:cs="Times New Roman"/>
+          <w:sz w:val="24"/>
+        </w:rPr>
+        <w:t>=</w:t>
+      </w:r>
+      <w:r>
+        <w:rPr>
+          <w:rFonts w:cs="Times New Roman"/>
+          <w:sz w:val="24"/>
+        </w:rPr>
+        <w:t xml:space="preserve"> </w:t>
+      </w:r>
+      <w:r>
+        <w:rPr>
+          <w:rFonts w:cs="Times New Roman"/>
+          <w:sz w:val="24"/>
+        </w:rPr>
+        <w:t>TIROCINIO.ID_TI;</w:t>
+      </w:r>
+    </w:p>
+    <w:p>
+      <w:pPr>
+        <w:ind w:left="0" w:right="192" w:firstLine="0"/>
+        <w:jc w:val="left"/>
+        <w:rPr>
+          <w:rFonts w:cs="Times New Roman"/>
+          <w:sz w:val="24"/>
+        </w:rPr>
+      </w:pPr>
+      <w:proofErr w:type="gramStart"/>
+      <w:r>
+        <w:rPr>
+          <w:rFonts w:cs="Times New Roman"/>
+          <w:sz w:val="24"/>
+        </w:rPr>
+        <w:t>RICHIESTA(</w:t>
+      </w:r>
+      <w:proofErr w:type="spellStart"/>
+      <w:proofErr w:type="gramEnd"/>
+      <w:r>
+        <w:rPr>
+          <w:rFonts w:cs="Times New Roman"/>
+          <w:b/>
+          <w:bCs/>
+          <w:sz w:val="24"/>
+        </w:rPr>
+        <w:t>ID_Ri</w:t>
+      </w:r>
+      <w:proofErr w:type="spellEnd"/>
+      <w:r>
+        <w:rPr>
+          <w:rFonts w:cs="Times New Roman"/>
+          <w:sz w:val="24"/>
+        </w:rPr>
+        <w:t>, Data, Stato</w:t>
+      </w:r>
+      <w:r>
+        <w:rPr>
+          <w:rFonts w:cs="Times New Roman"/>
+          <w:i/>
+          <w:iCs/>
+          <w:sz w:val="24"/>
+        </w:rPr>
+        <w:t xml:space="preserve">, </w:t>
+      </w:r>
+      <w:r>
+        <w:rPr>
+          <w:rFonts w:cs="Times New Roman"/>
+          <w:i/>
+          <w:iCs/>
+          <w:sz w:val="24"/>
+        </w:rPr>
+        <w:t>Login^</w:t>
+      </w:r>
+      <w:r>
+        <w:rPr>
+          <w:rFonts w:cs="Times New Roman"/>
+          <w:sz w:val="24"/>
+        </w:rPr>
+        <w:t xml:space="preserve">, </w:t>
+      </w:r>
+      <w:proofErr w:type="spellStart"/>
+      <w:r>
+        <w:rPr>
+          <w:rFonts w:cs="Times New Roman"/>
+          <w:i/>
+          <w:iCs/>
+          <w:sz w:val="24"/>
+        </w:rPr>
+        <w:t>ID_Ti</w:t>
+      </w:r>
+      <w:proofErr w:type="spellEnd"/>
+      <w:r>
+        <w:rPr>
+          <w:rFonts w:cs="Times New Roman"/>
+          <w:i/>
+          <w:iCs/>
+          <w:sz w:val="24"/>
+        </w:rPr>
+        <w:t>^</w:t>
+      </w:r>
+      <w:r>
+        <w:rPr>
+          <w:rFonts w:cs="Times New Roman"/>
+          <w:sz w:val="24"/>
+        </w:rPr>
+        <w:t>)</w:t>
+      </w:r>
+      <w:r>
+        <w:rPr>
+          <w:rFonts w:cs="Times New Roman"/>
+          <w:sz w:val="24"/>
+        </w:rPr>
+        <w:t>;</w:t>
+      </w:r>
+    </w:p>
+    <w:p>
+      <w:pPr>
+        <w:ind w:left="0" w:right="192" w:firstLine="0"/>
+        <w:jc w:val="left"/>
+        <w:rPr>
+          <w:rFonts w:cs="Times New Roman"/>
+          <w:sz w:val="24"/>
+        </w:rPr>
+      </w:pPr>
+      <w:proofErr w:type="spellStart"/>
+      <w:r>
+        <w:rPr>
+          <w:rFonts w:cs="Times New Roman"/>
+          <w:sz w:val="24"/>
+        </w:rPr>
+        <w:t>RICHIESTA.Login</w:t>
+      </w:r>
+      <w:proofErr w:type="spellEnd"/>
+      <w:r>
+        <w:rPr>
+          <w:rFonts w:cs="Times New Roman"/>
+          <w:sz w:val="24"/>
+        </w:rPr>
+        <w:t xml:space="preserve"> = </w:t>
+      </w:r>
+      <w:proofErr w:type="spellStart"/>
+      <w:r>
+        <w:rPr>
+          <w:rFonts w:cs="Times New Roman"/>
+          <w:sz w:val="24"/>
+        </w:rPr>
+        <w:t>STUDENTE.Login</w:t>
+      </w:r>
+      <w:proofErr w:type="spellEnd"/>
+      <w:r>
+        <w:rPr>
+          <w:rFonts w:cs="Times New Roman"/>
+          <w:sz w:val="24"/>
+        </w:rPr>
+        <w:t>;</w:t>
+      </w:r>
+    </w:p>
+    <w:p>
+      <w:pPr>
+        <w:ind w:left="0" w:right="192" w:firstLine="0"/>
+        <w:jc w:val="left"/>
+        <w:rPr>
+          <w:rFonts w:cs="Times New Roman"/>
+          <w:sz w:val="24"/>
+        </w:rPr>
+      </w:pPr>
+      <w:proofErr w:type="spellStart"/>
+      <w:r>
+        <w:rPr>
+          <w:rFonts w:cs="Times New Roman"/>
+          <w:sz w:val="24"/>
+        </w:rPr>
+        <w:t>RICHIESTA.ID_Ti</w:t>
+      </w:r>
+      <w:proofErr w:type="spellEnd"/>
+      <w:r>
+        <w:rPr>
+          <w:rFonts w:cs="Times New Roman"/>
+          <w:sz w:val="24"/>
+        </w:rPr>
+        <w:t xml:space="preserve"> = </w:t>
+      </w:r>
+      <w:proofErr w:type="spellStart"/>
+      <w:r>
+        <w:rPr>
+          <w:rFonts w:cs="Times New Roman"/>
+          <w:sz w:val="24"/>
+        </w:rPr>
+        <w:t>TIROCINIO.ID_Ti</w:t>
+      </w:r>
+      <w:proofErr w:type="spellEnd"/>
+      <w:r>
+        <w:rPr>
+          <w:rFonts w:cs="Times New Roman"/>
+          <w:sz w:val="24"/>
+        </w:rPr>
+        <w:t>;</w:t>
+      </w:r>
+    </w:p>
+    <w:p>
+      <w:pPr>
+        <w:ind w:left="0" w:right="192" w:firstLine="0"/>
+        <w:jc w:val="left"/>
+        <w:rPr>
+          <w:rFonts w:cs="Times New Roman"/>
+          <w:sz w:val="24"/>
+        </w:rPr>
+      </w:pPr>
+      <w:proofErr w:type="gramStart"/>
+      <w:r>
+        <w:rPr>
+          <w:rFonts w:cs="Times New Roman"/>
+          <w:sz w:val="24"/>
+        </w:rPr>
+        <w:t>TESI(</w:t>
+      </w:r>
+      <w:proofErr w:type="spellStart"/>
+      <w:proofErr w:type="gramEnd"/>
+      <w:r>
+        <w:rPr>
+          <w:rFonts w:cs="Times New Roman"/>
+          <w:b/>
+          <w:bCs/>
+          <w:sz w:val="24"/>
+        </w:rPr>
+        <w:t>ID_Te</w:t>
+      </w:r>
+      <w:proofErr w:type="spellEnd"/>
+      <w:r>
+        <w:rPr>
+          <w:rFonts w:cs="Times New Roman"/>
+          <w:sz w:val="24"/>
+        </w:rPr>
+        <w:t xml:space="preserve">, Stato, Contenuto, </w:t>
+      </w:r>
+      <w:proofErr w:type="spellStart"/>
+      <w:r>
+        <w:rPr>
+          <w:rFonts w:cs="Times New Roman"/>
+          <w:i/>
+          <w:iCs/>
+          <w:sz w:val="24"/>
+        </w:rPr>
+        <w:t>ID_Ri</w:t>
+      </w:r>
+      <w:proofErr w:type="spellEnd"/>
+      <w:r>
+        <w:rPr>
+          <w:rFonts w:cs="Times New Roman"/>
+          <w:i/>
+          <w:iCs/>
+          <w:sz w:val="24"/>
+        </w:rPr>
+        <w:t>^</w:t>
+      </w:r>
+      <w:r>
+        <w:rPr>
+          <w:rFonts w:cs="Times New Roman"/>
+          <w:sz w:val="24"/>
+        </w:rPr>
+        <w:t>);</w:t>
+      </w:r>
+    </w:p>
+    <w:p>
+      <w:pPr>
+        <w:ind w:left="0" w:right="192" w:firstLine="0"/>
+        <w:jc w:val="left"/>
+        <w:rPr>
+          <w:rFonts w:cs="Times New Roman"/>
+          <w:sz w:val="24"/>
+        </w:rPr>
+      </w:pPr>
+      <w:proofErr w:type="spellStart"/>
+      <w:r>
+        <w:rPr>
+          <w:rFonts w:cs="Times New Roman"/>
+          <w:sz w:val="24"/>
+        </w:rPr>
+        <w:t>TESI.ID_Ri</w:t>
+      </w:r>
+      <w:proofErr w:type="spellEnd"/>
+      <w:r>
+        <w:rPr>
+          <w:rFonts w:cs="Times New Roman"/>
+          <w:sz w:val="24"/>
+        </w:rPr>
+        <w:t xml:space="preserve"> = </w:t>
+      </w:r>
+      <w:proofErr w:type="spellStart"/>
+      <w:r>
+        <w:rPr>
+          <w:rFonts w:cs="Times New Roman"/>
+          <w:sz w:val="24"/>
+        </w:rPr>
+        <w:t>RICHIESTA.ID_Ri</w:t>
+      </w:r>
+      <w:proofErr w:type="spellEnd"/>
+      <w:r>
+        <w:rPr>
+          <w:rFonts w:cs="Times New Roman"/>
+          <w:sz w:val="24"/>
+        </w:rPr>
+        <w:t>;</w:t>
+      </w:r>
+    </w:p>
+    <w:p>
+      <w:pPr>
+        <w:ind w:left="0" w:right="192" w:firstLine="0"/>
+        <w:jc w:val="left"/>
+        <w:rPr>
+          <w:rFonts w:cs="Times New Roman"/>
+          <w:sz w:val="24"/>
+        </w:rPr>
+      </w:pPr>
+      <w:proofErr w:type="gramStart"/>
+      <w:r>
+        <w:rPr>
+          <w:rFonts w:cs="Times New Roman"/>
+          <w:sz w:val="24"/>
+        </w:rPr>
+        <w:t>SEDUTA(</w:t>
+      </w:r>
+      <w:proofErr w:type="spellStart"/>
+      <w:proofErr w:type="gramEnd"/>
+      <w:r>
+        <w:rPr>
+          <w:rFonts w:cs="Times New Roman"/>
+          <w:b/>
+          <w:bCs/>
+          <w:sz w:val="24"/>
+        </w:rPr>
+        <w:t>ID_Se</w:t>
+      </w:r>
+      <w:proofErr w:type="spellEnd"/>
+      <w:r>
+        <w:rPr>
+          <w:rFonts w:cs="Times New Roman"/>
+          <w:sz w:val="24"/>
+        </w:rPr>
+        <w:t xml:space="preserve">, </w:t>
+      </w:r>
+      <w:proofErr w:type="spellStart"/>
+      <w:proofErr w:type="gramStart"/>
+      <w:r>
+        <w:rPr>
+          <w:rFonts w:cs="Times New Roman"/>
+          <w:sz w:val="24"/>
+        </w:rPr>
+        <w:t>Data,Ora</w:t>
+      </w:r>
+      <w:proofErr w:type="gramEnd"/>
+      <w:r>
+        <w:rPr>
+          <w:rFonts w:cs="Times New Roman"/>
+          <w:sz w:val="24"/>
+        </w:rPr>
+        <w:t>,</w:t>
+      </w:r>
+      <w:proofErr w:type="gramStart"/>
+      <w:r>
+        <w:rPr>
+          <w:rFonts w:cs="Times New Roman"/>
+          <w:sz w:val="24"/>
+        </w:rPr>
+        <w:t>VotoFinale,</w:t>
+      </w:r>
+      <w:r>
+        <w:rPr>
+          <w:rFonts w:cs="Times New Roman"/>
+          <w:i/>
+          <w:iCs/>
+          <w:sz w:val="24"/>
+        </w:rPr>
+        <w:t>ID</w:t>
+      </w:r>
+      <w:proofErr w:type="gramEnd"/>
+      <w:r>
+        <w:rPr>
+          <w:rFonts w:cs="Times New Roman"/>
+          <w:i/>
+          <w:iCs/>
+          <w:sz w:val="24"/>
+        </w:rPr>
+        <w:t>_Te</w:t>
+      </w:r>
+      <w:proofErr w:type="gramStart"/>
+      <w:r>
+        <w:rPr>
+          <w:rFonts w:cs="Times New Roman"/>
+          <w:i/>
+          <w:iCs/>
+          <w:sz w:val="24"/>
+        </w:rPr>
+        <w:t>^</w:t>
+      </w:r>
+      <w:r>
+        <w:rPr>
+          <w:rFonts w:cs="Times New Roman"/>
+          <w:sz w:val="24"/>
+        </w:rPr>
+        <w:t>,</w:t>
+      </w:r>
+      <w:r>
+        <w:rPr>
+          <w:rFonts w:cs="Times New Roman"/>
+          <w:i/>
+          <w:iCs/>
+          <w:sz w:val="24"/>
+        </w:rPr>
+        <w:t>Login</w:t>
+      </w:r>
+      <w:proofErr w:type="spellEnd"/>
+      <w:proofErr w:type="gramEnd"/>
+      <w:r>
+        <w:rPr>
+          <w:rFonts w:cs="Times New Roman"/>
+          <w:i/>
+          <w:iCs/>
+          <w:sz w:val="24"/>
+        </w:rPr>
+        <w:t>^</w:t>
+      </w:r>
+      <w:r>
+        <w:rPr>
+          <w:rFonts w:cs="Times New Roman"/>
+          <w:sz w:val="24"/>
+        </w:rPr>
+        <w:t>)</w:t>
+      </w:r>
+    </w:p>
+    <w:p>
+      <w:pPr>
+        <w:ind w:left="0" w:right="192" w:firstLine="0"/>
+        <w:jc w:val="left"/>
+        <w:rPr>
+          <w:rFonts w:cs="Times New Roman"/>
+          <w:sz w:val="24"/>
+        </w:rPr>
+      </w:pPr>
+      <w:proofErr w:type="spellStart"/>
+      <w:r>
+        <w:rPr>
+          <w:rFonts w:cs="Times New Roman"/>
+          <w:sz w:val="24"/>
+        </w:rPr>
+        <w:t>SEDUTA.ID_Te</w:t>
+      </w:r>
+      <w:proofErr w:type="spellEnd"/>
+      <w:r>
+        <w:rPr>
+          <w:rFonts w:cs="Times New Roman"/>
+          <w:sz w:val="24"/>
+        </w:rPr>
+        <w:t xml:space="preserve"> = </w:t>
+      </w:r>
+      <w:proofErr w:type="spellStart"/>
+      <w:r>
+        <w:rPr>
+          <w:rFonts w:cs="Times New Roman"/>
+          <w:sz w:val="24"/>
+        </w:rPr>
+        <w:t>TESI.ID_Te</w:t>
+      </w:r>
+      <w:proofErr w:type="spellEnd"/>
+      <w:r>
+        <w:rPr>
+          <w:rFonts w:cs="Times New Roman"/>
+          <w:sz w:val="24"/>
+        </w:rPr>
+        <w:t>;</w:t>
+      </w:r>
+    </w:p>
+    <w:p>
+      <w:pPr>
+        <w:ind w:left="0" w:right="192" w:firstLine="0"/>
+        <w:jc w:val="left"/>
+        <w:rPr>
+          <w:rFonts w:cs="Times New Roman"/>
+          <w:sz w:val="24"/>
+        </w:rPr>
+      </w:pPr>
+      <w:proofErr w:type="spellStart"/>
+      <w:r>
+        <w:rPr>
+          <w:rFonts w:cs="Times New Roman"/>
+          <w:sz w:val="24"/>
+        </w:rPr>
+        <w:t>SEDUTA.Login</w:t>
+      </w:r>
+      <w:proofErr w:type="spellEnd"/>
+      <w:r>
+        <w:rPr>
+          <w:rFonts w:cs="Times New Roman"/>
+          <w:sz w:val="24"/>
+        </w:rPr>
+        <w:t xml:space="preserve"> = </w:t>
+      </w:r>
+      <w:proofErr w:type="spellStart"/>
+      <w:r>
+        <w:rPr>
+          <w:rFonts w:cs="Times New Roman"/>
+          <w:sz w:val="24"/>
+        </w:rPr>
+        <w:t>DOCENTE.Login</w:t>
+      </w:r>
+      <w:proofErr w:type="spellEnd"/>
+      <w:r>
+        <w:rPr>
+          <w:rFonts w:cs="Times New Roman"/>
+          <w:sz w:val="24"/>
+        </w:rPr>
+        <w:t>;</w:t>
+      </w:r>
+    </w:p>
+    <w:p>
+      <w:pPr>
+        <w:ind w:left="0" w:right="192" w:firstLine="0"/>
+        <w:rPr>
+          <w:rFonts w:cs="Times New Roman"/>
+          <w:b/>
+          <w:bCs/>
+          <w:sz w:val="29"/>
+          <w:szCs w:val="29"/>
+        </w:rPr>
+      </w:pPr>
     </w:p>
     <w:sectPr>
       <w:footerReference w:type="even" r:id="rId9"/>

</xml_diff>

<commit_message>
Patch-up DAO Implementation & general db clean-up
AGG PULZZAT
</commit_message>
<xml_diff>
--- a/doc/documentazioneFinale/BD2526-Seduta-Iosso_La Mura_FINALE.docx
+++ b/doc/documentazioneFinale/BD2526-Seduta-Iosso_La Mura_FINALE.docx
@@ -5784,7 +5784,23 @@
           <w:szCs w:val="20"/>
           <w:lang w:val="en-US"/>
         </w:rPr>
-        <w:t>2048),</w:t>
+        <w:t>2048)</w:t>
+      </w:r>
+      <w:r>
+        <w:rPr>
+          <w:rFonts w:cs="Times New Roman"/>
+          <w:szCs w:val="20"/>
+          <w:lang w:val="en-US"/>
+        </w:rPr>
+        <w:t xml:space="preserve"> UNIQUE</w:t>
+      </w:r>
+      <w:r>
+        <w:rPr>
+          <w:rFonts w:cs="Times New Roman"/>
+          <w:szCs w:val="20"/>
+          <w:lang w:val="en-US"/>
+        </w:rPr>
+        <w:t>,</w:t>
       </w:r>
     </w:p>
     <w:p>
@@ -8790,9 +8806,8 @@
           <w:szCs w:val="20"/>
           <w:lang w:val="en-US"/>
         </w:rPr>
-        <w:t xml:space="preserve"> AND ((</w:t>
-      </w:r>
-      <w:proofErr w:type="spellStart"/>
+        <w:t xml:space="preserve"> </w:t>
+      </w:r>
       <w:proofErr w:type="gramStart"/>
       <w:r>
         <w:rPr>
@@ -8800,6 +8815,15 @@
           <w:szCs w:val="20"/>
           <w:lang w:val="en-US"/>
         </w:rPr>
+        <w:t>AND ((</w:t>
+      </w:r>
+      <w:proofErr w:type="spellStart"/>
+      <w:r>
+        <w:rPr>
+          <w:rFonts w:cs="Times New Roman"/>
+          <w:szCs w:val="20"/>
+          <w:lang w:val="en-US"/>
+        </w:rPr>
         <w:t>NEW.Stato</w:t>
       </w:r>
       <w:proofErr w:type="spellEnd"/>
@@ -8884,7 +8908,39 @@
           <w:szCs w:val="20"/>
           <w:lang w:val="en-US"/>
         </w:rPr>
-        <w:t xml:space="preserve">!=X AND </w:t>
+        <w:t>!=</w:t>
+      </w:r>
+      <w:r>
+        <w:rPr>
+          <w:rFonts w:cs="Times New Roman"/>
+          <w:szCs w:val="20"/>
+          <w:lang w:val="en-US"/>
+        </w:rPr>
+        <w:t>’</w:t>
+      </w:r>
+      <w:r>
+        <w:rPr>
+          <w:rFonts w:cs="Times New Roman"/>
+          <w:szCs w:val="20"/>
+          <w:lang w:val="en-US"/>
+        </w:rPr>
+        <w:t>X</w:t>
+      </w:r>
+      <w:r>
+        <w:rPr>
+          <w:rFonts w:cs="Times New Roman"/>
+          <w:szCs w:val="20"/>
+          <w:lang w:val="en-US"/>
+        </w:rPr>
+        <w:t>’</w:t>
+      </w:r>
+      <w:r>
+        <w:rPr>
+          <w:rFonts w:cs="Times New Roman"/>
+          <w:szCs w:val="20"/>
+          <w:lang w:val="en-US"/>
+        </w:rPr>
+        <w:t xml:space="preserve"> AND </w:t>
       </w:r>
       <w:proofErr w:type="spellStart"/>
       <w:proofErr w:type="gramStart"/>
@@ -10098,6 +10154,13 @@
           <w:lang w:val="en-US"/>
         </w:rPr>
         <w:tab/>
+      </w:r>
+      <w:r>
+        <w:rPr>
+          <w:rFonts w:cs="Times New Roman"/>
+          <w:szCs w:val="20"/>
+          <w:lang w:val="en-US"/>
+        </w:rPr>
         <w:t>FOR EACH ROW</w:t>
       </w:r>
     </w:p>
@@ -11011,6 +11074,13 @@
           <w:lang w:val="en-US"/>
         </w:rPr>
         <w:tab/>
+      </w:r>
+      <w:r>
+        <w:rPr>
+          <w:rFonts w:cs="Times New Roman"/>
+          <w:szCs w:val="20"/>
+          <w:lang w:val="en-US"/>
+        </w:rPr>
         <w:t>FOR EACH ROW</w:t>
       </w:r>
     </w:p>
@@ -15859,14 +15929,12 @@
         <w:rPr>
           <w:rFonts w:cs="Times New Roman"/>
           <w:szCs w:val="20"/>
-          <w:lang w:val="en-US"/>
-        </w:rPr>
-      </w:pPr>
-      <w:r>
-        <w:rPr>
-          <w:rFonts w:cs="Times New Roman"/>
-          <w:szCs w:val="20"/>
-          <w:lang w:val="en-US"/>
+        </w:rPr>
+      </w:pPr>
+      <w:r>
+        <w:rPr>
+          <w:rFonts w:cs="Times New Roman"/>
+          <w:szCs w:val="20"/>
         </w:rPr>
         <w:t xml:space="preserve">EXECUTE FUNCTION </w:t>
       </w:r>
@@ -15876,7 +15944,6 @@
         <w:rPr>
           <w:rFonts w:cs="Times New Roman"/>
           <w:szCs w:val="20"/>
-          <w:lang w:val="en-US"/>
         </w:rPr>
         <w:t>SedutaRimuoviAnnullamentoTesi</w:t>
       </w:r>
@@ -15885,7 +15952,6 @@
         <w:rPr>
           <w:rFonts w:cs="Times New Roman"/>
           <w:szCs w:val="20"/>
-          <w:lang w:val="en-US"/>
         </w:rPr>
         <w:t>(</w:t>
       </w:r>
@@ -15894,7 +15960,6 @@
         <w:rPr>
           <w:rFonts w:cs="Times New Roman"/>
           <w:szCs w:val="20"/>
-          <w:lang w:val="en-US"/>
         </w:rPr>
         <w:t>);</w:t>
       </w:r>
@@ -15906,270 +15971,245 @@
         <w:rPr>
           <w:rFonts w:cs="Times New Roman"/>
           <w:szCs w:val="20"/>
-          <w:lang w:val="en-US"/>
-        </w:rPr>
-      </w:pPr>
-    </w:p>
-    <w:p>
-      <w:pPr>
-        <w:ind w:left="0" w:right="192" w:firstLine="0"/>
-        <w:jc w:val="left"/>
-        <w:rPr>
-          <w:rFonts w:cs="Times New Roman"/>
-          <w:szCs w:val="20"/>
-          <w:lang w:val="en-US"/>
-        </w:rPr>
-      </w:pPr>
-    </w:p>
-    <w:p>
-      <w:pPr>
-        <w:ind w:left="0" w:right="192" w:firstLine="0"/>
-        <w:jc w:val="left"/>
-        <w:rPr>
-          <w:rFonts w:cs="Times New Roman"/>
-          <w:szCs w:val="20"/>
-          <w:lang w:val="en-US"/>
-        </w:rPr>
-      </w:pPr>
-    </w:p>
-    <w:p>
-      <w:pPr>
-        <w:ind w:left="0" w:right="192" w:firstLine="0"/>
-        <w:jc w:val="left"/>
-        <w:rPr>
-          <w:rFonts w:cs="Times New Roman"/>
-          <w:szCs w:val="20"/>
-          <w:lang w:val="en-US"/>
-        </w:rPr>
-      </w:pPr>
-    </w:p>
-    <w:p>
-      <w:pPr>
-        <w:ind w:left="0" w:right="192" w:firstLine="0"/>
-        <w:jc w:val="left"/>
-        <w:rPr>
-          <w:rFonts w:cs="Times New Roman"/>
-          <w:szCs w:val="20"/>
-          <w:lang w:val="en-US"/>
-        </w:rPr>
-      </w:pPr>
-    </w:p>
-    <w:p>
-      <w:pPr>
-        <w:ind w:left="0" w:right="192" w:firstLine="0"/>
-        <w:jc w:val="left"/>
-        <w:rPr>
-          <w:rFonts w:cs="Times New Roman"/>
-          <w:szCs w:val="20"/>
-          <w:lang w:val="en-US"/>
-        </w:rPr>
-      </w:pPr>
-    </w:p>
-    <w:p>
-      <w:pPr>
-        <w:ind w:left="0" w:right="192" w:firstLine="0"/>
-        <w:jc w:val="left"/>
-        <w:rPr>
-          <w:rFonts w:cs="Times New Roman"/>
-          <w:szCs w:val="20"/>
-          <w:lang w:val="en-US"/>
-        </w:rPr>
-      </w:pPr>
-    </w:p>
-    <w:p>
-      <w:pPr>
-        <w:ind w:left="0" w:right="192" w:firstLine="0"/>
-        <w:jc w:val="left"/>
-        <w:rPr>
-          <w:rFonts w:cs="Times New Roman"/>
-          <w:szCs w:val="20"/>
-          <w:lang w:val="en-US"/>
-        </w:rPr>
-      </w:pPr>
-    </w:p>
-    <w:p>
-      <w:pPr>
-        <w:ind w:left="0" w:right="192" w:firstLine="0"/>
-        <w:jc w:val="left"/>
-        <w:rPr>
-          <w:rFonts w:cs="Times New Roman"/>
-          <w:szCs w:val="20"/>
-          <w:lang w:val="en-US"/>
-        </w:rPr>
-      </w:pPr>
-    </w:p>
-    <w:p>
-      <w:pPr>
-        <w:ind w:left="0" w:right="192" w:firstLine="0"/>
-        <w:jc w:val="left"/>
-        <w:rPr>
-          <w:rFonts w:cs="Times New Roman"/>
-          <w:szCs w:val="20"/>
-          <w:lang w:val="en-US"/>
-        </w:rPr>
-      </w:pPr>
-    </w:p>
-    <w:p>
-      <w:pPr>
-        <w:ind w:left="0" w:right="192" w:firstLine="0"/>
-        <w:jc w:val="left"/>
-        <w:rPr>
-          <w:rFonts w:cs="Times New Roman"/>
-          <w:szCs w:val="20"/>
-          <w:lang w:val="en-US"/>
-        </w:rPr>
-      </w:pPr>
-    </w:p>
-    <w:p>
-      <w:pPr>
-        <w:ind w:left="0" w:right="192" w:firstLine="0"/>
-        <w:jc w:val="left"/>
-        <w:rPr>
-          <w:rFonts w:cs="Times New Roman"/>
-          <w:szCs w:val="20"/>
-          <w:lang w:val="en-US"/>
-        </w:rPr>
-      </w:pPr>
-    </w:p>
-    <w:p>
-      <w:pPr>
-        <w:ind w:left="0" w:right="192" w:firstLine="0"/>
-        <w:jc w:val="left"/>
-        <w:rPr>
-          <w:rFonts w:cs="Times New Roman"/>
-          <w:szCs w:val="20"/>
-          <w:lang w:val="en-US"/>
-        </w:rPr>
-      </w:pPr>
-    </w:p>
-    <w:p>
-      <w:pPr>
-        <w:ind w:left="0" w:right="192" w:firstLine="0"/>
-        <w:jc w:val="left"/>
-        <w:rPr>
-          <w:rFonts w:cs="Times New Roman"/>
-          <w:szCs w:val="20"/>
-          <w:lang w:val="en-US"/>
-        </w:rPr>
-      </w:pPr>
-    </w:p>
-    <w:p>
-      <w:pPr>
-        <w:ind w:left="0" w:right="192" w:firstLine="0"/>
-        <w:jc w:val="left"/>
-        <w:rPr>
-          <w:rFonts w:cs="Times New Roman"/>
-          <w:szCs w:val="20"/>
-          <w:lang w:val="en-US"/>
-        </w:rPr>
-      </w:pPr>
-    </w:p>
-    <w:p>
-      <w:pPr>
-        <w:ind w:left="0" w:right="192" w:firstLine="0"/>
-        <w:jc w:val="left"/>
-        <w:rPr>
-          <w:rFonts w:cs="Times New Roman"/>
-          <w:szCs w:val="20"/>
-          <w:lang w:val="en-US"/>
-        </w:rPr>
-      </w:pPr>
-    </w:p>
-    <w:p>
-      <w:pPr>
-        <w:ind w:left="0" w:right="192" w:firstLine="0"/>
-        <w:jc w:val="left"/>
-        <w:rPr>
-          <w:rFonts w:cs="Times New Roman"/>
-          <w:szCs w:val="20"/>
-          <w:lang w:val="en-US"/>
-        </w:rPr>
-      </w:pPr>
-    </w:p>
-    <w:p>
-      <w:pPr>
-        <w:ind w:left="0" w:right="192" w:firstLine="0"/>
-        <w:jc w:val="left"/>
-        <w:rPr>
-          <w:rFonts w:cs="Times New Roman"/>
-          <w:szCs w:val="20"/>
-          <w:lang w:val="en-US"/>
-        </w:rPr>
-      </w:pPr>
-    </w:p>
-    <w:p>
-      <w:pPr>
-        <w:ind w:left="0" w:right="192" w:firstLine="0"/>
-        <w:jc w:val="left"/>
-        <w:rPr>
-          <w:rFonts w:cs="Times New Roman"/>
-          <w:szCs w:val="20"/>
-          <w:lang w:val="en-US"/>
-        </w:rPr>
-      </w:pPr>
-    </w:p>
-    <w:p>
-      <w:pPr>
-        <w:ind w:left="0" w:right="192" w:firstLine="0"/>
-        <w:jc w:val="left"/>
-        <w:rPr>
-          <w:rFonts w:cs="Times New Roman"/>
-          <w:szCs w:val="20"/>
-          <w:lang w:val="en-US"/>
-        </w:rPr>
-      </w:pPr>
-    </w:p>
-    <w:p>
-      <w:pPr>
-        <w:ind w:left="0" w:right="192" w:firstLine="0"/>
-        <w:jc w:val="left"/>
-        <w:rPr>
-          <w:rFonts w:cs="Times New Roman"/>
-          <w:szCs w:val="20"/>
-          <w:lang w:val="en-US"/>
-        </w:rPr>
-      </w:pPr>
-    </w:p>
-    <w:p>
-      <w:pPr>
-        <w:ind w:left="0" w:right="192" w:firstLine="0"/>
-        <w:jc w:val="left"/>
-        <w:rPr>
-          <w:rFonts w:cs="Times New Roman"/>
-          <w:szCs w:val="20"/>
-          <w:lang w:val="en-US"/>
-        </w:rPr>
-      </w:pPr>
-    </w:p>
-    <w:p>
-      <w:pPr>
-        <w:ind w:left="0" w:right="192" w:firstLine="0"/>
-        <w:jc w:val="left"/>
-        <w:rPr>
-          <w:rFonts w:cs="Times New Roman"/>
-          <w:b/>
-          <w:bCs/>
-          <w:szCs w:val="20"/>
-          <w:lang w:val="en-US"/>
-        </w:rPr>
-      </w:pPr>
-      <w:r>
-        <w:rPr>
-          <w:rFonts w:cs="Times New Roman"/>
-          <w:b/>
-          <w:bCs/>
-          <w:szCs w:val="20"/>
-          <w:lang w:val="en-US"/>
-        </w:rPr>
-        <w:t>5.2.11</w:t>
-      </w:r>
-      <w:r>
-        <w:rPr>
-          <w:rFonts w:cs="Times New Roman"/>
-          <w:b/>
-          <w:bCs/>
-          <w:szCs w:val="20"/>
-          <w:lang w:val="en-US"/>
+        </w:rPr>
+      </w:pPr>
+    </w:p>
+    <w:p>
+      <w:pPr>
+        <w:ind w:left="0" w:right="192" w:firstLine="0"/>
+        <w:jc w:val="left"/>
+        <w:rPr>
+          <w:rFonts w:cs="Times New Roman"/>
+          <w:szCs w:val="20"/>
+        </w:rPr>
+      </w:pPr>
+    </w:p>
+    <w:p>
+      <w:pPr>
+        <w:ind w:left="0" w:right="192" w:firstLine="0"/>
+        <w:jc w:val="left"/>
+        <w:rPr>
+          <w:rFonts w:cs="Times New Roman"/>
+          <w:szCs w:val="20"/>
+        </w:rPr>
+      </w:pPr>
+    </w:p>
+    <w:p>
+      <w:pPr>
+        <w:ind w:left="0" w:right="192" w:firstLine="0"/>
+        <w:jc w:val="left"/>
+        <w:rPr>
+          <w:rFonts w:cs="Times New Roman"/>
+          <w:szCs w:val="20"/>
+        </w:rPr>
+      </w:pPr>
+    </w:p>
+    <w:p>
+      <w:pPr>
+        <w:ind w:left="0" w:right="192" w:firstLine="0"/>
+        <w:jc w:val="left"/>
+        <w:rPr>
+          <w:rFonts w:cs="Times New Roman"/>
+          <w:szCs w:val="20"/>
+        </w:rPr>
+      </w:pPr>
+    </w:p>
+    <w:p>
+      <w:pPr>
+        <w:ind w:left="0" w:right="192" w:firstLine="0"/>
+        <w:jc w:val="left"/>
+        <w:rPr>
+          <w:rFonts w:cs="Times New Roman"/>
+          <w:szCs w:val="20"/>
+        </w:rPr>
+      </w:pPr>
+    </w:p>
+    <w:p>
+      <w:pPr>
+        <w:ind w:left="0" w:right="192" w:firstLine="0"/>
+        <w:jc w:val="left"/>
+        <w:rPr>
+          <w:rFonts w:cs="Times New Roman"/>
+          <w:szCs w:val="20"/>
+        </w:rPr>
+      </w:pPr>
+    </w:p>
+    <w:p>
+      <w:pPr>
+        <w:ind w:left="0" w:right="192" w:firstLine="0"/>
+        <w:jc w:val="left"/>
+        <w:rPr>
+          <w:rFonts w:cs="Times New Roman"/>
+          <w:szCs w:val="20"/>
+        </w:rPr>
+      </w:pPr>
+    </w:p>
+    <w:p>
+      <w:pPr>
+        <w:ind w:left="0" w:right="192" w:firstLine="0"/>
+        <w:jc w:val="left"/>
+        <w:rPr>
+          <w:rFonts w:cs="Times New Roman"/>
+          <w:szCs w:val="20"/>
+        </w:rPr>
+      </w:pPr>
+    </w:p>
+    <w:p>
+      <w:pPr>
+        <w:ind w:left="0" w:right="192" w:firstLine="0"/>
+        <w:jc w:val="left"/>
+        <w:rPr>
+          <w:rFonts w:cs="Times New Roman"/>
+          <w:szCs w:val="20"/>
+        </w:rPr>
+      </w:pPr>
+    </w:p>
+    <w:p>
+      <w:pPr>
+        <w:ind w:left="0" w:right="192" w:firstLine="0"/>
+        <w:jc w:val="left"/>
+        <w:rPr>
+          <w:rFonts w:cs="Times New Roman"/>
+          <w:szCs w:val="20"/>
+        </w:rPr>
+      </w:pPr>
+    </w:p>
+    <w:p>
+      <w:pPr>
+        <w:ind w:left="0" w:right="192" w:firstLine="0"/>
+        <w:jc w:val="left"/>
+        <w:rPr>
+          <w:rFonts w:cs="Times New Roman"/>
+          <w:szCs w:val="20"/>
+        </w:rPr>
+      </w:pPr>
+    </w:p>
+    <w:p>
+      <w:pPr>
+        <w:ind w:left="0" w:right="192" w:firstLine="0"/>
+        <w:jc w:val="left"/>
+        <w:rPr>
+          <w:rFonts w:cs="Times New Roman"/>
+          <w:szCs w:val="20"/>
+        </w:rPr>
+      </w:pPr>
+    </w:p>
+    <w:p>
+      <w:pPr>
+        <w:ind w:left="0" w:right="192" w:firstLine="0"/>
+        <w:jc w:val="left"/>
+        <w:rPr>
+          <w:rFonts w:cs="Times New Roman"/>
+          <w:szCs w:val="20"/>
+        </w:rPr>
+      </w:pPr>
+    </w:p>
+    <w:p>
+      <w:pPr>
+        <w:ind w:left="0" w:right="192" w:firstLine="0"/>
+        <w:jc w:val="left"/>
+        <w:rPr>
+          <w:rFonts w:cs="Times New Roman"/>
+          <w:szCs w:val="20"/>
+        </w:rPr>
+      </w:pPr>
+    </w:p>
+    <w:p>
+      <w:pPr>
+        <w:ind w:left="0" w:right="192" w:firstLine="0"/>
+        <w:jc w:val="left"/>
+        <w:rPr>
+          <w:rFonts w:cs="Times New Roman"/>
+          <w:szCs w:val="20"/>
+        </w:rPr>
+      </w:pPr>
+    </w:p>
+    <w:p>
+      <w:pPr>
+        <w:ind w:left="0" w:right="192" w:firstLine="0"/>
+        <w:jc w:val="left"/>
+        <w:rPr>
+          <w:rFonts w:cs="Times New Roman"/>
+          <w:szCs w:val="20"/>
+        </w:rPr>
+      </w:pPr>
+    </w:p>
+    <w:p>
+      <w:pPr>
+        <w:ind w:left="0" w:right="192" w:firstLine="0"/>
+        <w:jc w:val="left"/>
+        <w:rPr>
+          <w:rFonts w:cs="Times New Roman"/>
+          <w:szCs w:val="20"/>
+        </w:rPr>
+      </w:pPr>
+    </w:p>
+    <w:p>
+      <w:pPr>
+        <w:ind w:left="0" w:right="192" w:firstLine="0"/>
+        <w:jc w:val="left"/>
+        <w:rPr>
+          <w:rFonts w:cs="Times New Roman"/>
+          <w:szCs w:val="20"/>
+        </w:rPr>
+      </w:pPr>
+    </w:p>
+    <w:p>
+      <w:pPr>
+        <w:ind w:left="0" w:right="192" w:firstLine="0"/>
+        <w:jc w:val="left"/>
+        <w:rPr>
+          <w:rFonts w:cs="Times New Roman"/>
+          <w:szCs w:val="20"/>
+        </w:rPr>
+      </w:pPr>
+    </w:p>
+    <w:p>
+      <w:pPr>
+        <w:ind w:left="0" w:right="192" w:firstLine="0"/>
+        <w:jc w:val="left"/>
+        <w:rPr>
+          <w:rFonts w:cs="Times New Roman"/>
+          <w:szCs w:val="20"/>
+        </w:rPr>
+      </w:pPr>
+    </w:p>
+    <w:p>
+      <w:pPr>
+        <w:ind w:left="0" w:right="192" w:firstLine="0"/>
+        <w:jc w:val="left"/>
+        <w:rPr>
+          <w:rFonts w:cs="Times New Roman"/>
+          <w:b/>
+          <w:bCs/>
+          <w:szCs w:val="20"/>
+        </w:rPr>
+      </w:pPr>
+      <w:r>
+        <w:rPr>
+          <w:rFonts w:cs="Times New Roman"/>
+          <w:b/>
+          <w:bCs/>
+          <w:szCs w:val="20"/>
+        </w:rPr>
+        <w:lastRenderedPageBreak/>
+        <w:t>5.2.1</w:t>
+      </w:r>
+      <w:r>
+        <w:rPr>
+          <w:rFonts w:cs="Times New Roman"/>
+          <w:b/>
+          <w:bCs/>
+          <w:szCs w:val="20"/>
+        </w:rPr>
+        <w:t>1</w:t>
+      </w:r>
+      <w:r>
+        <w:rPr>
+          <w:rFonts w:cs="Times New Roman"/>
+          <w:b/>
+          <w:bCs/>
+          <w:szCs w:val="20"/>
         </w:rPr>
         <w:t xml:space="preserve"> </w:t>
       </w:r>
@@ -16180,32 +16220,20 @@
           <w:b/>
           <w:bCs/>
           <w:szCs w:val="20"/>
-          <w:lang w:val="en-US"/>
-        </w:rPr>
-        <w:t>Tesi</w:t>
-      </w:r>
-      <w:r>
-        <w:rPr>
-          <w:rFonts w:cs="Times New Roman"/>
-          <w:b/>
-          <w:bCs/>
-          <w:szCs w:val="20"/>
-          <w:lang w:val="en-US"/>
-        </w:rPr>
-        <w:t>Unique</w:t>
-      </w:r>
-      <w:proofErr w:type="spellEnd"/>
-    </w:p>
-    <w:p>
-      <w:pPr>
-        <w:ind w:left="0" w:right="192" w:firstLine="0"/>
-        <w:jc w:val="left"/>
-        <w:rPr>
-          <w:rFonts w:cs="Times New Roman"/>
-          <w:b/>
-          <w:bCs/>
-          <w:szCs w:val="20"/>
-          <w:lang w:val="en-US"/>
+        </w:rPr>
+        <w:t>SedutaAggiungiVotoSuTesi</w:t>
+      </w:r>
+      <w:proofErr w:type="spellEnd"/>
+    </w:p>
+    <w:p>
+      <w:pPr>
+        <w:ind w:left="0" w:right="192" w:firstLine="0"/>
+        <w:jc w:val="left"/>
+        <w:rPr>
+          <w:rFonts w:cs="Times New Roman"/>
+          <w:b/>
+          <w:bCs/>
+          <w:szCs w:val="20"/>
         </w:rPr>
       </w:pPr>
     </w:p>
@@ -16235,7 +16263,7 @@
           <w:szCs w:val="20"/>
           <w:lang w:val="en-US"/>
         </w:rPr>
-        <w:t>TesiUnique</w:t>
+        <w:t>SedutaAggiungiVotoSuTesi</w:t>
       </w:r>
       <w:proofErr w:type="spellEnd"/>
       <w:r>
@@ -16273,6 +16301,923 @@
           <w:lang w:val="en-US"/>
         </w:rPr>
         <w:tab/>
+        <w:t>RETURNS trigger AS</w:t>
+      </w:r>
+    </w:p>
+    <w:p>
+      <w:pPr>
+        <w:ind w:left="0" w:right="192" w:firstLine="0"/>
+        <w:jc w:val="left"/>
+        <w:rPr>
+          <w:rFonts w:cs="Times New Roman"/>
+          <w:szCs w:val="20"/>
+          <w:lang w:val="en-US"/>
+        </w:rPr>
+      </w:pPr>
+      <w:r>
+        <w:rPr>
+          <w:rFonts w:cs="Times New Roman"/>
+          <w:szCs w:val="20"/>
+          <w:lang w:val="en-US"/>
+        </w:rPr>
+        <w:t>$</w:t>
+      </w:r>
+      <w:proofErr w:type="spellStart"/>
+      <w:r>
+        <w:rPr>
+          <w:rFonts w:cs="Times New Roman"/>
+          <w:szCs w:val="20"/>
+          <w:lang w:val="en-US"/>
+        </w:rPr>
+        <w:t>SedutaAggiungiVotoSuTesi</w:t>
+      </w:r>
+      <w:proofErr w:type="spellEnd"/>
+      <w:r>
+        <w:rPr>
+          <w:rFonts w:cs="Times New Roman"/>
+          <w:szCs w:val="20"/>
+          <w:lang w:val="en-US"/>
+        </w:rPr>
+        <w:t>$</w:t>
+      </w:r>
+    </w:p>
+    <w:p>
+      <w:pPr>
+        <w:ind w:left="0" w:right="192" w:firstLine="0"/>
+        <w:jc w:val="left"/>
+        <w:rPr>
+          <w:rFonts w:cs="Times New Roman"/>
+          <w:szCs w:val="20"/>
+          <w:lang w:val="en-US"/>
+        </w:rPr>
+      </w:pPr>
+      <w:r>
+        <w:rPr>
+          <w:rFonts w:cs="Times New Roman"/>
+          <w:szCs w:val="20"/>
+          <w:lang w:val="en-US"/>
+        </w:rPr>
+        <w:t>BEGIN</w:t>
+      </w:r>
+    </w:p>
+    <w:p>
+      <w:pPr>
+        <w:ind w:left="0" w:right="192" w:firstLine="0"/>
+        <w:jc w:val="left"/>
+        <w:rPr>
+          <w:rFonts w:cs="Times New Roman"/>
+          <w:szCs w:val="20"/>
+          <w:lang w:val="en-US"/>
+        </w:rPr>
+      </w:pPr>
+      <w:r>
+        <w:rPr>
+          <w:rFonts w:cs="Times New Roman"/>
+          <w:szCs w:val="20"/>
+          <w:lang w:val="en-US"/>
+        </w:rPr>
+        <w:tab/>
+        <w:t xml:space="preserve">IF </w:t>
+      </w:r>
+      <w:proofErr w:type="gramStart"/>
+      <w:r>
+        <w:rPr>
+          <w:rFonts w:cs="Times New Roman"/>
+          <w:szCs w:val="20"/>
+          <w:lang w:val="en-US"/>
+        </w:rPr>
+        <w:t>ISNOTNULL(</w:t>
+      </w:r>
+      <w:proofErr w:type="spellStart"/>
+      <w:proofErr w:type="gramEnd"/>
+      <w:r>
+        <w:rPr>
+          <w:rFonts w:cs="Times New Roman"/>
+          <w:szCs w:val="20"/>
+          <w:lang w:val="en-US"/>
+        </w:rPr>
+        <w:t>NEW.VotoFinale</w:t>
+      </w:r>
+      <w:proofErr w:type="spellEnd"/>
+      <w:r>
+        <w:rPr>
+          <w:rFonts w:cs="Times New Roman"/>
+          <w:szCs w:val="20"/>
+          <w:lang w:val="en-US"/>
+        </w:rPr>
+        <w:t>) AND ISNULL(</w:t>
+      </w:r>
+      <w:proofErr w:type="spellStart"/>
+      <w:r>
+        <w:rPr>
+          <w:rFonts w:cs="Times New Roman"/>
+          <w:szCs w:val="20"/>
+          <w:lang w:val="en-US"/>
+        </w:rPr>
+        <w:t>NEW.ID_Te</w:t>
+      </w:r>
+      <w:proofErr w:type="spellEnd"/>
+      <w:r>
+        <w:rPr>
+          <w:rFonts w:cs="Times New Roman"/>
+          <w:szCs w:val="20"/>
+          <w:lang w:val="en-US"/>
+        </w:rPr>
+        <w:t>)</w:t>
+      </w:r>
+    </w:p>
+    <w:p>
+      <w:pPr>
+        <w:ind w:left="0" w:right="192" w:firstLine="0"/>
+        <w:jc w:val="left"/>
+        <w:rPr>
+          <w:rFonts w:cs="Times New Roman"/>
+          <w:szCs w:val="20"/>
+          <w:lang w:val="en-US"/>
+        </w:rPr>
+      </w:pPr>
+      <w:r>
+        <w:rPr>
+          <w:rFonts w:cs="Times New Roman"/>
+          <w:szCs w:val="20"/>
+          <w:lang w:val="en-US"/>
+        </w:rPr>
+        <w:tab/>
+      </w:r>
+      <w:r>
+        <w:rPr>
+          <w:rFonts w:cs="Times New Roman"/>
+          <w:szCs w:val="20"/>
+          <w:lang w:val="en-US"/>
+        </w:rPr>
+        <w:tab/>
+        <w:t xml:space="preserve">THEN RAISE EXCEPTION 'Tesi </w:t>
+      </w:r>
+      <w:proofErr w:type="spellStart"/>
+      <w:r>
+        <w:rPr>
+          <w:rFonts w:cs="Times New Roman"/>
+          <w:szCs w:val="20"/>
+          <w:lang w:val="en-US"/>
+        </w:rPr>
+        <w:t>mancante</w:t>
+      </w:r>
+      <w:proofErr w:type="spellEnd"/>
+      <w:r>
+        <w:rPr>
+          <w:rFonts w:cs="Times New Roman"/>
+          <w:szCs w:val="20"/>
+          <w:lang w:val="en-US"/>
+        </w:rPr>
+        <w:t xml:space="preserve"> per </w:t>
+      </w:r>
+      <w:proofErr w:type="spellStart"/>
+      <w:r>
+        <w:rPr>
+          <w:rFonts w:cs="Times New Roman"/>
+          <w:szCs w:val="20"/>
+          <w:lang w:val="en-US"/>
+        </w:rPr>
+        <w:t>voto</w:t>
+      </w:r>
+      <w:proofErr w:type="spellEnd"/>
+      <w:r>
+        <w:rPr>
+          <w:rFonts w:cs="Times New Roman"/>
+          <w:szCs w:val="20"/>
+          <w:lang w:val="en-US"/>
+        </w:rPr>
+        <w:t>'</w:t>
+      </w:r>
+      <w:r>
+        <w:rPr>
+          <w:rFonts w:cs="Times New Roman"/>
+          <w:szCs w:val="20"/>
+          <w:lang w:val="en-US"/>
+        </w:rPr>
+        <w:t>;</w:t>
+      </w:r>
+    </w:p>
+    <w:p>
+      <w:pPr>
+        <w:ind w:left="0" w:right="192" w:firstLine="0"/>
+        <w:jc w:val="left"/>
+        <w:rPr>
+          <w:rFonts w:cs="Times New Roman"/>
+          <w:szCs w:val="20"/>
+          <w:lang w:val="en-US"/>
+        </w:rPr>
+      </w:pPr>
+      <w:r>
+        <w:rPr>
+          <w:rFonts w:cs="Times New Roman"/>
+          <w:szCs w:val="20"/>
+          <w:lang w:val="en-US"/>
+        </w:rPr>
+        <w:tab/>
+        <w:t>END</w:t>
+      </w:r>
+      <w:r>
+        <w:rPr>
+          <w:rFonts w:cs="Times New Roman"/>
+          <w:szCs w:val="20"/>
+          <w:lang w:val="en-US"/>
+        </w:rPr>
+        <w:t xml:space="preserve"> </w:t>
+      </w:r>
+      <w:r>
+        <w:rPr>
+          <w:rFonts w:cs="Times New Roman"/>
+          <w:szCs w:val="20"/>
+          <w:lang w:val="en-US"/>
+        </w:rPr>
+        <w:t>IF;</w:t>
+      </w:r>
+    </w:p>
+    <w:p>
+      <w:pPr>
+        <w:ind w:left="0" w:right="192" w:firstLine="0"/>
+        <w:jc w:val="left"/>
+        <w:rPr>
+          <w:rFonts w:cs="Times New Roman"/>
+          <w:szCs w:val="20"/>
+          <w:lang w:val="en-US"/>
+        </w:rPr>
+      </w:pPr>
+      <w:r>
+        <w:rPr>
+          <w:rFonts w:cs="Times New Roman"/>
+          <w:szCs w:val="20"/>
+          <w:lang w:val="en-US"/>
+        </w:rPr>
+        <w:tab/>
+        <w:t>RETURN NEW;</w:t>
+      </w:r>
+    </w:p>
+    <w:p>
+      <w:pPr>
+        <w:ind w:left="0" w:right="192" w:firstLine="0"/>
+        <w:jc w:val="left"/>
+        <w:rPr>
+          <w:rFonts w:cs="Times New Roman"/>
+          <w:szCs w:val="20"/>
+          <w:lang w:val="en-US"/>
+        </w:rPr>
+      </w:pPr>
+      <w:r>
+        <w:rPr>
+          <w:rFonts w:cs="Times New Roman"/>
+          <w:szCs w:val="20"/>
+          <w:lang w:val="en-US"/>
+        </w:rPr>
+        <w:t>END</w:t>
+      </w:r>
+    </w:p>
+    <w:p>
+      <w:pPr>
+        <w:ind w:left="0" w:right="192" w:firstLine="0"/>
+        <w:jc w:val="left"/>
+        <w:rPr>
+          <w:rFonts w:cs="Times New Roman"/>
+          <w:szCs w:val="20"/>
+          <w:lang w:val="en-US"/>
+        </w:rPr>
+      </w:pPr>
+      <w:r>
+        <w:rPr>
+          <w:rFonts w:cs="Times New Roman"/>
+          <w:szCs w:val="20"/>
+          <w:lang w:val="en-US"/>
+        </w:rPr>
+        <w:t>$</w:t>
+      </w:r>
+      <w:proofErr w:type="spellStart"/>
+      <w:r>
+        <w:rPr>
+          <w:rFonts w:cs="Times New Roman"/>
+          <w:szCs w:val="20"/>
+          <w:lang w:val="en-US"/>
+        </w:rPr>
+        <w:t>SedutaAggiungiVotoSuTesi</w:t>
+      </w:r>
+      <w:proofErr w:type="spellEnd"/>
+      <w:r>
+        <w:rPr>
+          <w:rFonts w:cs="Times New Roman"/>
+          <w:szCs w:val="20"/>
+          <w:lang w:val="en-US"/>
+        </w:rPr>
+        <w:t xml:space="preserve">$ LANGUAGE </w:t>
+      </w:r>
+      <w:proofErr w:type="spellStart"/>
+      <w:r>
+        <w:rPr>
+          <w:rFonts w:cs="Times New Roman"/>
+          <w:szCs w:val="20"/>
+          <w:lang w:val="en-US"/>
+        </w:rPr>
+        <w:t>plpgsql</w:t>
+      </w:r>
+      <w:proofErr w:type="spellEnd"/>
+      <w:r>
+        <w:rPr>
+          <w:rFonts w:cs="Times New Roman"/>
+          <w:szCs w:val="20"/>
+          <w:lang w:val="en-US"/>
+        </w:rPr>
+        <w:t>;</w:t>
+      </w:r>
+    </w:p>
+    <w:p>
+      <w:pPr>
+        <w:ind w:left="0" w:right="192" w:firstLine="0"/>
+        <w:jc w:val="left"/>
+        <w:rPr>
+          <w:rFonts w:cs="Times New Roman"/>
+          <w:szCs w:val="20"/>
+          <w:lang w:val="en-US"/>
+        </w:rPr>
+      </w:pPr>
+    </w:p>
+    <w:p>
+      <w:pPr>
+        <w:ind w:left="0" w:right="192" w:firstLine="0"/>
+        <w:jc w:val="left"/>
+        <w:rPr>
+          <w:rFonts w:cs="Times New Roman"/>
+          <w:szCs w:val="20"/>
+          <w:lang w:val="en-US"/>
+        </w:rPr>
+      </w:pPr>
+      <w:r>
+        <w:rPr>
+          <w:rFonts w:cs="Times New Roman"/>
+          <w:szCs w:val="20"/>
+          <w:lang w:val="en-US"/>
+        </w:rPr>
+        <w:t xml:space="preserve">CREATE OR REPLACE TRIGGER </w:t>
+      </w:r>
+      <w:proofErr w:type="spellStart"/>
+      <w:r>
+        <w:rPr>
+          <w:rFonts w:cs="Times New Roman"/>
+          <w:szCs w:val="20"/>
+          <w:lang w:val="en-US"/>
+        </w:rPr>
+        <w:t>SedutaAggiungiVotoSuTesiTrigger</w:t>
+      </w:r>
+      <w:proofErr w:type="spellEnd"/>
+    </w:p>
+    <w:p>
+      <w:pPr>
+        <w:ind w:left="0" w:right="192" w:firstLine="0"/>
+        <w:jc w:val="left"/>
+        <w:rPr>
+          <w:rFonts w:cs="Times New Roman"/>
+          <w:szCs w:val="20"/>
+          <w:lang w:val="en-US"/>
+        </w:rPr>
+      </w:pPr>
+      <w:r>
+        <w:rPr>
+          <w:rFonts w:cs="Times New Roman"/>
+          <w:szCs w:val="20"/>
+          <w:lang w:val="en-US"/>
+        </w:rPr>
+        <w:tab/>
+        <w:t>BEFORE UPDATE ON Tesi</w:t>
+      </w:r>
+    </w:p>
+    <w:p>
+      <w:pPr>
+        <w:ind w:left="0" w:right="192" w:firstLine="0"/>
+        <w:jc w:val="left"/>
+        <w:rPr>
+          <w:rFonts w:cs="Times New Roman"/>
+          <w:szCs w:val="20"/>
+          <w:lang w:val="en-US"/>
+        </w:rPr>
+      </w:pPr>
+      <w:r>
+        <w:rPr>
+          <w:rFonts w:cs="Times New Roman"/>
+          <w:szCs w:val="20"/>
+          <w:lang w:val="en-US"/>
+        </w:rPr>
+        <w:tab/>
+        <w:t>FOR EACH ROW</w:t>
+      </w:r>
+    </w:p>
+    <w:p>
+      <w:pPr>
+        <w:ind w:left="0" w:right="192" w:firstLine="0"/>
+        <w:jc w:val="left"/>
+        <w:rPr>
+          <w:rFonts w:cs="Times New Roman"/>
+          <w:szCs w:val="20"/>
+          <w:lang w:val="en-US"/>
+        </w:rPr>
+      </w:pPr>
+      <w:r>
+        <w:rPr>
+          <w:rFonts w:cs="Times New Roman"/>
+          <w:szCs w:val="20"/>
+          <w:lang w:val="en-US"/>
+        </w:rPr>
+        <w:t xml:space="preserve">EXECUTE FUNCTION </w:t>
+      </w:r>
+      <w:proofErr w:type="spellStart"/>
+      <w:proofErr w:type="gramStart"/>
+      <w:r>
+        <w:rPr>
+          <w:rFonts w:cs="Times New Roman"/>
+          <w:szCs w:val="20"/>
+          <w:lang w:val="en-US"/>
+        </w:rPr>
+        <w:t>Sedu</w:t>
+      </w:r>
+      <w:r>
+        <w:rPr>
+          <w:rFonts w:cs="Times New Roman"/>
+          <w:szCs w:val="20"/>
+          <w:lang w:val="en-US"/>
+        </w:rPr>
+        <w:t>t</w:t>
+      </w:r>
+      <w:r>
+        <w:rPr>
+          <w:rFonts w:cs="Times New Roman"/>
+          <w:szCs w:val="20"/>
+          <w:lang w:val="en-US"/>
+        </w:rPr>
+        <w:t>aAggiungiVotoSuTesi</w:t>
+      </w:r>
+      <w:proofErr w:type="spellEnd"/>
+      <w:r>
+        <w:rPr>
+          <w:rFonts w:cs="Times New Roman"/>
+          <w:szCs w:val="20"/>
+          <w:lang w:val="en-US"/>
+        </w:rPr>
+        <w:t>(</w:t>
+      </w:r>
+      <w:proofErr w:type="gramEnd"/>
+      <w:r>
+        <w:rPr>
+          <w:rFonts w:cs="Times New Roman"/>
+          <w:szCs w:val="20"/>
+          <w:lang w:val="en-US"/>
+        </w:rPr>
+        <w:t>);</w:t>
+      </w:r>
+    </w:p>
+    <w:p>
+      <w:pPr>
+        <w:ind w:left="0" w:right="192" w:firstLine="0"/>
+        <w:jc w:val="left"/>
+        <w:rPr>
+          <w:rFonts w:cs="Times New Roman"/>
+          <w:szCs w:val="20"/>
+          <w:lang w:val="en-US"/>
+        </w:rPr>
+      </w:pPr>
+    </w:p>
+    <w:p>
+      <w:pPr>
+        <w:ind w:left="0" w:right="192" w:firstLine="0"/>
+        <w:jc w:val="left"/>
+        <w:rPr>
+          <w:rFonts w:cs="Times New Roman"/>
+          <w:b/>
+          <w:bCs/>
+          <w:szCs w:val="20"/>
+          <w:lang w:val="en-US"/>
+        </w:rPr>
+      </w:pPr>
+    </w:p>
+    <w:p>
+      <w:pPr>
+        <w:ind w:left="0" w:right="192" w:firstLine="0"/>
+        <w:jc w:val="left"/>
+        <w:rPr>
+          <w:rFonts w:cs="Times New Roman"/>
+          <w:b/>
+          <w:bCs/>
+          <w:szCs w:val="20"/>
+          <w:lang w:val="en-US"/>
+        </w:rPr>
+      </w:pPr>
+    </w:p>
+    <w:p>
+      <w:pPr>
+        <w:ind w:left="0" w:right="192" w:firstLine="0"/>
+        <w:jc w:val="left"/>
+        <w:rPr>
+          <w:rFonts w:cs="Times New Roman"/>
+          <w:b/>
+          <w:bCs/>
+          <w:szCs w:val="20"/>
+          <w:lang w:val="en-US"/>
+        </w:rPr>
+      </w:pPr>
+    </w:p>
+    <w:p>
+      <w:pPr>
+        <w:ind w:left="0" w:right="192" w:firstLine="0"/>
+        <w:jc w:val="left"/>
+        <w:rPr>
+          <w:rFonts w:cs="Times New Roman"/>
+          <w:b/>
+          <w:bCs/>
+          <w:szCs w:val="20"/>
+          <w:lang w:val="en-US"/>
+        </w:rPr>
+      </w:pPr>
+    </w:p>
+    <w:p>
+      <w:pPr>
+        <w:ind w:left="0" w:right="192" w:firstLine="0"/>
+        <w:jc w:val="left"/>
+        <w:rPr>
+          <w:rFonts w:cs="Times New Roman"/>
+          <w:b/>
+          <w:bCs/>
+          <w:szCs w:val="20"/>
+          <w:lang w:val="en-US"/>
+        </w:rPr>
+      </w:pPr>
+    </w:p>
+    <w:p>
+      <w:pPr>
+        <w:ind w:left="0" w:right="192" w:firstLine="0"/>
+        <w:jc w:val="left"/>
+        <w:rPr>
+          <w:rFonts w:cs="Times New Roman"/>
+          <w:b/>
+          <w:bCs/>
+          <w:szCs w:val="20"/>
+          <w:lang w:val="en-US"/>
+        </w:rPr>
+      </w:pPr>
+    </w:p>
+    <w:p>
+      <w:pPr>
+        <w:ind w:left="0" w:right="192" w:firstLine="0"/>
+        <w:jc w:val="left"/>
+        <w:rPr>
+          <w:rFonts w:cs="Times New Roman"/>
+          <w:b/>
+          <w:bCs/>
+          <w:szCs w:val="20"/>
+          <w:lang w:val="en-US"/>
+        </w:rPr>
+      </w:pPr>
+    </w:p>
+    <w:p>
+      <w:pPr>
+        <w:ind w:left="0" w:right="192" w:firstLine="0"/>
+        <w:jc w:val="left"/>
+        <w:rPr>
+          <w:rFonts w:cs="Times New Roman"/>
+          <w:b/>
+          <w:bCs/>
+          <w:szCs w:val="20"/>
+          <w:lang w:val="en-US"/>
+        </w:rPr>
+      </w:pPr>
+    </w:p>
+    <w:p>
+      <w:pPr>
+        <w:ind w:left="0" w:right="192" w:firstLine="0"/>
+        <w:jc w:val="left"/>
+        <w:rPr>
+          <w:rFonts w:cs="Times New Roman"/>
+          <w:b/>
+          <w:bCs/>
+          <w:szCs w:val="20"/>
+          <w:lang w:val="en-US"/>
+        </w:rPr>
+      </w:pPr>
+    </w:p>
+    <w:p>
+      <w:pPr>
+        <w:ind w:left="0" w:right="192" w:firstLine="0"/>
+        <w:jc w:val="left"/>
+        <w:rPr>
+          <w:rFonts w:cs="Times New Roman"/>
+          <w:b/>
+          <w:bCs/>
+          <w:szCs w:val="20"/>
+          <w:lang w:val="en-US"/>
+        </w:rPr>
+      </w:pPr>
+    </w:p>
+    <w:p>
+      <w:pPr>
+        <w:ind w:left="0" w:right="192" w:firstLine="0"/>
+        <w:jc w:val="left"/>
+        <w:rPr>
+          <w:rFonts w:cs="Times New Roman"/>
+          <w:b/>
+          <w:bCs/>
+          <w:szCs w:val="20"/>
+          <w:lang w:val="en-US"/>
+        </w:rPr>
+      </w:pPr>
+    </w:p>
+    <w:p>
+      <w:pPr>
+        <w:ind w:left="0" w:right="192" w:firstLine="0"/>
+        <w:jc w:val="left"/>
+        <w:rPr>
+          <w:rFonts w:cs="Times New Roman"/>
+          <w:b/>
+          <w:bCs/>
+          <w:szCs w:val="20"/>
+          <w:lang w:val="en-US"/>
+        </w:rPr>
+      </w:pPr>
+    </w:p>
+    <w:p>
+      <w:pPr>
+        <w:ind w:left="0" w:right="192" w:firstLine="0"/>
+        <w:jc w:val="left"/>
+        <w:rPr>
+          <w:rFonts w:cs="Times New Roman"/>
+          <w:b/>
+          <w:bCs/>
+          <w:szCs w:val="20"/>
+          <w:lang w:val="en-US"/>
+        </w:rPr>
+      </w:pPr>
+    </w:p>
+    <w:p>
+      <w:pPr>
+        <w:ind w:left="0" w:right="192" w:firstLine="0"/>
+        <w:jc w:val="left"/>
+        <w:rPr>
+          <w:rFonts w:cs="Times New Roman"/>
+          <w:b/>
+          <w:bCs/>
+          <w:szCs w:val="20"/>
+          <w:lang w:val="en-US"/>
+        </w:rPr>
+      </w:pPr>
+    </w:p>
+    <w:p>
+      <w:pPr>
+        <w:ind w:left="0" w:right="192" w:firstLine="0"/>
+        <w:jc w:val="left"/>
+        <w:rPr>
+          <w:rFonts w:cs="Times New Roman"/>
+          <w:b/>
+          <w:bCs/>
+          <w:szCs w:val="20"/>
+          <w:lang w:val="en-US"/>
+        </w:rPr>
+      </w:pPr>
+    </w:p>
+    <w:p>
+      <w:pPr>
+        <w:ind w:left="0" w:right="192" w:firstLine="0"/>
+        <w:jc w:val="left"/>
+        <w:rPr>
+          <w:rFonts w:cs="Times New Roman"/>
+          <w:b/>
+          <w:bCs/>
+          <w:szCs w:val="20"/>
+          <w:lang w:val="en-US"/>
+        </w:rPr>
+      </w:pPr>
+    </w:p>
+    <w:p>
+      <w:pPr>
+        <w:ind w:left="0" w:right="192" w:firstLine="0"/>
+        <w:jc w:val="left"/>
+        <w:rPr>
+          <w:rFonts w:cs="Times New Roman"/>
+          <w:b/>
+          <w:bCs/>
+          <w:szCs w:val="20"/>
+          <w:lang w:val="en-US"/>
+        </w:rPr>
+      </w:pPr>
+    </w:p>
+    <w:p>
+      <w:pPr>
+        <w:ind w:left="0" w:right="192" w:firstLine="0"/>
+        <w:jc w:val="left"/>
+        <w:rPr>
+          <w:rFonts w:cs="Times New Roman"/>
+          <w:b/>
+          <w:bCs/>
+          <w:szCs w:val="20"/>
+          <w:lang w:val="en-US"/>
+        </w:rPr>
+      </w:pPr>
+    </w:p>
+    <w:p>
+      <w:pPr>
+        <w:ind w:left="0" w:right="192" w:firstLine="0"/>
+        <w:jc w:val="left"/>
+        <w:rPr>
+          <w:rFonts w:cs="Times New Roman"/>
+          <w:b/>
+          <w:bCs/>
+          <w:szCs w:val="20"/>
+          <w:lang w:val="en-US"/>
+        </w:rPr>
+      </w:pPr>
+    </w:p>
+    <w:p>
+      <w:pPr>
+        <w:ind w:left="0" w:right="192" w:firstLine="0"/>
+        <w:jc w:val="left"/>
+        <w:rPr>
+          <w:rFonts w:cs="Times New Roman"/>
+          <w:b/>
+          <w:bCs/>
+          <w:szCs w:val="20"/>
+          <w:lang w:val="en-US"/>
+        </w:rPr>
+      </w:pPr>
+    </w:p>
+    <w:p>
+      <w:pPr>
+        <w:ind w:left="0" w:right="192" w:firstLine="0"/>
+        <w:jc w:val="left"/>
+        <w:rPr>
+          <w:rFonts w:cs="Times New Roman"/>
+          <w:b/>
+          <w:bCs/>
+          <w:szCs w:val="20"/>
+          <w:lang w:val="en-US"/>
+        </w:rPr>
+      </w:pPr>
+    </w:p>
+    <w:p>
+      <w:pPr>
+        <w:ind w:left="0" w:right="192" w:firstLine="0"/>
+        <w:jc w:val="left"/>
+        <w:rPr>
+          <w:rFonts w:cs="Times New Roman"/>
+          <w:b/>
+          <w:bCs/>
+          <w:szCs w:val="20"/>
+          <w:lang w:val="en-US"/>
+        </w:rPr>
+      </w:pPr>
+    </w:p>
+    <w:p>
+      <w:pPr>
+        <w:ind w:left="0" w:right="192" w:firstLine="0"/>
+        <w:jc w:val="left"/>
+        <w:rPr>
+          <w:rFonts w:cs="Times New Roman"/>
+          <w:b/>
+          <w:bCs/>
+          <w:szCs w:val="20"/>
+          <w:lang w:val="en-US"/>
+        </w:rPr>
+      </w:pPr>
+    </w:p>
+    <w:p>
+      <w:pPr>
+        <w:ind w:left="0" w:right="192" w:firstLine="0"/>
+        <w:jc w:val="left"/>
+        <w:rPr>
+          <w:rFonts w:cs="Times New Roman"/>
+          <w:b/>
+          <w:bCs/>
+          <w:szCs w:val="20"/>
+          <w:lang w:val="en-US"/>
+        </w:rPr>
+      </w:pPr>
+    </w:p>
+    <w:p>
+      <w:pPr>
+        <w:ind w:left="0" w:right="192" w:firstLine="0"/>
+        <w:jc w:val="left"/>
+        <w:rPr>
+          <w:rFonts w:cs="Times New Roman"/>
+          <w:b/>
+          <w:bCs/>
+          <w:szCs w:val="20"/>
+          <w:lang w:val="en-US"/>
+        </w:rPr>
+      </w:pPr>
+    </w:p>
+    <w:p>
+      <w:pPr>
+        <w:ind w:left="0" w:right="192" w:firstLine="0"/>
+        <w:jc w:val="left"/>
+        <w:rPr>
+          <w:rFonts w:cs="Times New Roman"/>
+          <w:b/>
+          <w:bCs/>
+          <w:szCs w:val="20"/>
+          <w:lang w:val="en-US"/>
+        </w:rPr>
+      </w:pPr>
+      <w:r>
+        <w:rPr>
+          <w:rFonts w:cs="Times New Roman"/>
+          <w:b/>
+          <w:bCs/>
+          <w:szCs w:val="20"/>
+          <w:lang w:val="en-US"/>
+        </w:rPr>
+        <w:lastRenderedPageBreak/>
+        <w:t xml:space="preserve">5.2.12 </w:t>
+      </w:r>
+      <w:proofErr w:type="spellStart"/>
+      <w:r>
+        <w:rPr>
+          <w:rFonts w:cs="Times New Roman"/>
+          <w:b/>
+          <w:bCs/>
+          <w:szCs w:val="20"/>
+          <w:lang w:val="en-US"/>
+        </w:rPr>
+        <w:t>SedutaControlloDataTirocinio</w:t>
+      </w:r>
+      <w:proofErr w:type="spellEnd"/>
+    </w:p>
+    <w:p>
+      <w:pPr>
+        <w:ind w:left="0" w:right="192" w:firstLine="0"/>
+        <w:jc w:val="left"/>
+        <w:rPr>
+          <w:rFonts w:cs="Times New Roman"/>
+          <w:szCs w:val="20"/>
+          <w:lang w:val="en-US"/>
+        </w:rPr>
+      </w:pPr>
+    </w:p>
+    <w:p>
+      <w:pPr>
+        <w:ind w:left="0" w:right="192" w:firstLine="0"/>
+        <w:jc w:val="left"/>
+        <w:rPr>
+          <w:rFonts w:cs="Times New Roman"/>
+          <w:szCs w:val="20"/>
+          <w:lang w:val="en-US"/>
+        </w:rPr>
+      </w:pPr>
+      <w:r>
+        <w:rPr>
+          <w:rFonts w:cs="Times New Roman"/>
+          <w:szCs w:val="20"/>
+          <w:lang w:val="en-US"/>
+        </w:rPr>
+        <w:t xml:space="preserve">CREATE OR REPLACE FUNCTION </w:t>
+      </w:r>
+      <w:proofErr w:type="spellStart"/>
+      <w:proofErr w:type="gramStart"/>
+      <w:r>
+        <w:rPr>
+          <w:rFonts w:cs="Times New Roman"/>
+          <w:szCs w:val="20"/>
+          <w:lang w:val="en-US"/>
+        </w:rPr>
+        <w:t>SedutaControlloDataTirocinio</w:t>
+      </w:r>
+      <w:proofErr w:type="spellEnd"/>
+      <w:r>
+        <w:rPr>
+          <w:rFonts w:cs="Times New Roman"/>
+          <w:szCs w:val="20"/>
+          <w:lang w:val="en-US"/>
+        </w:rPr>
+        <w:t>(</w:t>
+      </w:r>
+      <w:proofErr w:type="gramEnd"/>
+      <w:r>
+        <w:rPr>
+          <w:rFonts w:cs="Times New Roman"/>
+          <w:szCs w:val="20"/>
+          <w:lang w:val="en-US"/>
+        </w:rPr>
+        <w:t>)</w:t>
+      </w:r>
+    </w:p>
+    <w:p>
+      <w:pPr>
+        <w:ind w:left="0" w:right="192" w:firstLine="0"/>
+        <w:jc w:val="left"/>
+        <w:rPr>
+          <w:rFonts w:cs="Times New Roman"/>
+          <w:szCs w:val="20"/>
+          <w:lang w:val="en-US"/>
+        </w:rPr>
+      </w:pPr>
+      <w:r>
+        <w:rPr>
+          <w:rFonts w:cs="Times New Roman"/>
+          <w:szCs w:val="20"/>
+          <w:lang w:val="en-US"/>
+        </w:rPr>
+        <w:tab/>
         <w:t xml:space="preserve">RETURNS trigger AS </w:t>
       </w:r>
     </w:p>
@@ -16283,14 +17228,12 @@
         <w:rPr>
           <w:rFonts w:cs="Times New Roman"/>
           <w:szCs w:val="20"/>
-          <w:lang w:val="en-US"/>
-        </w:rPr>
-      </w:pPr>
-      <w:r>
-        <w:rPr>
-          <w:rFonts w:cs="Times New Roman"/>
-          <w:szCs w:val="20"/>
-          <w:lang w:val="en-US"/>
+        </w:rPr>
+      </w:pPr>
+      <w:r>
+        <w:rPr>
+          <w:rFonts w:cs="Times New Roman"/>
+          <w:szCs w:val="20"/>
         </w:rPr>
         <w:t>$</w:t>
       </w:r>
@@ -16299,16 +17242,14 @@
         <w:rPr>
           <w:rFonts w:cs="Times New Roman"/>
           <w:szCs w:val="20"/>
-          <w:lang w:val="en-US"/>
-        </w:rPr>
-        <w:t>TesiUnique</w:t>
-      </w:r>
-      <w:proofErr w:type="spellEnd"/>
-      <w:r>
-        <w:rPr>
-          <w:rFonts w:cs="Times New Roman"/>
-          <w:szCs w:val="20"/>
-          <w:lang w:val="en-US"/>
+        </w:rPr>
+        <w:t>SedutaControlloDataTirocinio</w:t>
+      </w:r>
+      <w:proofErr w:type="spellEnd"/>
+      <w:r>
+        <w:rPr>
+          <w:rFonts w:cs="Times New Roman"/>
+          <w:szCs w:val="20"/>
         </w:rPr>
         <w:t>$</w:t>
       </w:r>
@@ -16320,14 +17261,62 @@
         <w:rPr>
           <w:rFonts w:cs="Times New Roman"/>
           <w:szCs w:val="20"/>
-          <w:lang w:val="en-US"/>
-        </w:rPr>
-      </w:pPr>
-      <w:r>
-        <w:rPr>
-          <w:rFonts w:cs="Times New Roman"/>
-          <w:szCs w:val="20"/>
-          <w:lang w:val="en-US"/>
+        </w:rPr>
+      </w:pPr>
+      <w:r>
+        <w:rPr>
+          <w:rFonts w:cs="Times New Roman"/>
+          <w:szCs w:val="20"/>
+        </w:rPr>
+        <w:t>DECLARE</w:t>
+      </w:r>
+    </w:p>
+    <w:p>
+      <w:pPr>
+        <w:ind w:left="0" w:right="192" w:firstLine="0"/>
+        <w:jc w:val="left"/>
+        <w:rPr>
+          <w:rFonts w:cs="Times New Roman"/>
+          <w:szCs w:val="20"/>
+        </w:rPr>
+      </w:pPr>
+      <w:r>
+        <w:rPr>
+          <w:rFonts w:cs="Times New Roman"/>
+          <w:szCs w:val="20"/>
+        </w:rPr>
+        <w:tab/>
+      </w:r>
+      <w:proofErr w:type="spellStart"/>
+      <w:r>
+        <w:rPr>
+          <w:rFonts w:cs="Times New Roman"/>
+          <w:szCs w:val="20"/>
+        </w:rPr>
+        <w:t>data_tirocinio</w:t>
+      </w:r>
+      <w:proofErr w:type="spellEnd"/>
+      <w:r>
+        <w:rPr>
+          <w:rFonts w:cs="Times New Roman"/>
+          <w:szCs w:val="20"/>
+        </w:rPr>
+        <w:t xml:space="preserve"> DATE;</w:t>
+      </w:r>
+    </w:p>
+    <w:p>
+      <w:pPr>
+        <w:ind w:left="0" w:right="192" w:firstLine="0"/>
+        <w:jc w:val="left"/>
+        <w:rPr>
+          <w:rFonts w:cs="Times New Roman"/>
+          <w:szCs w:val="20"/>
+        </w:rPr>
+      </w:pPr>
+      <w:r>
+        <w:rPr>
+          <w:rFonts w:cs="Times New Roman"/>
+          <w:szCs w:val="20"/>
         </w:rPr>
         <w:t>BEGIN</w:t>
       </w:r>
@@ -16339,18 +17328,564 @@
         <w:rPr>
           <w:rFonts w:cs="Times New Roman"/>
           <w:szCs w:val="20"/>
-          <w:lang w:val="en-US"/>
-        </w:rPr>
-      </w:pPr>
-      <w:r>
-        <w:rPr>
-          <w:rFonts w:cs="Times New Roman"/>
-          <w:szCs w:val="20"/>
-          <w:lang w:val="en-US"/>
-        </w:rPr>
-        <w:tab/>
+        </w:rPr>
+      </w:pPr>
+      <w:r>
+        <w:rPr>
+          <w:rFonts w:cs="Times New Roman"/>
+          <w:szCs w:val="20"/>
+        </w:rPr>
+        <w:tab/>
+        <w:t xml:space="preserve">SELECT </w:t>
+      </w:r>
+      <w:proofErr w:type="spellStart"/>
+      <w:r>
+        <w:rPr>
+          <w:rFonts w:cs="Times New Roman"/>
+          <w:szCs w:val="20"/>
+        </w:rPr>
+        <w:t>T.Data</w:t>
+      </w:r>
+      <w:proofErr w:type="spellEnd"/>
+      <w:r>
+        <w:rPr>
+          <w:rFonts w:cs="Times New Roman"/>
+          <w:szCs w:val="20"/>
+        </w:rPr>
+        <w:t xml:space="preserve"> INTO </w:t>
+      </w:r>
+      <w:proofErr w:type="spellStart"/>
+      <w:r>
+        <w:rPr>
+          <w:rFonts w:cs="Times New Roman"/>
+          <w:szCs w:val="20"/>
+        </w:rPr>
+        <w:t>data_tirocinio</w:t>
+      </w:r>
+      <w:proofErr w:type="spellEnd"/>
+    </w:p>
+    <w:p>
+      <w:pPr>
+        <w:ind w:left="0" w:right="192" w:firstLine="0"/>
+        <w:jc w:val="left"/>
+        <w:rPr>
+          <w:rFonts w:cs="Times New Roman"/>
+          <w:szCs w:val="20"/>
+        </w:rPr>
+      </w:pPr>
+      <w:r>
+        <w:rPr>
+          <w:rFonts w:cs="Times New Roman"/>
+          <w:szCs w:val="20"/>
+        </w:rPr>
+        <w:tab/>
+        <w:t>FROM TESI Te</w:t>
+      </w:r>
+    </w:p>
+    <w:p>
+      <w:pPr>
+        <w:ind w:left="0" w:right="192" w:firstLine="0"/>
+        <w:jc w:val="left"/>
+        <w:rPr>
+          <w:rFonts w:cs="Times New Roman"/>
+          <w:szCs w:val="20"/>
+        </w:rPr>
+      </w:pPr>
+      <w:r>
+        <w:rPr>
+          <w:rFonts w:cs="Times New Roman"/>
+          <w:szCs w:val="20"/>
+        </w:rPr>
+        <w:tab/>
+        <w:t xml:space="preserve">JOIN RICHIESTA R ON </w:t>
+      </w:r>
+      <w:proofErr w:type="spellStart"/>
+      <w:r>
+        <w:rPr>
+          <w:rFonts w:cs="Times New Roman"/>
+          <w:szCs w:val="20"/>
+        </w:rPr>
+        <w:t>Te.ID_Ri</w:t>
+      </w:r>
+      <w:proofErr w:type="spellEnd"/>
+      <w:r>
+        <w:rPr>
+          <w:rFonts w:cs="Times New Roman"/>
+          <w:szCs w:val="20"/>
+        </w:rPr>
+        <w:t xml:space="preserve"> = </w:t>
+      </w:r>
+      <w:proofErr w:type="spellStart"/>
+      <w:r>
+        <w:rPr>
+          <w:rFonts w:cs="Times New Roman"/>
+          <w:szCs w:val="20"/>
+        </w:rPr>
+        <w:t>R.ID_Ri</w:t>
+      </w:r>
+      <w:proofErr w:type="spellEnd"/>
+    </w:p>
+    <w:p>
+      <w:pPr>
+        <w:ind w:left="0" w:right="192" w:firstLine="0"/>
+        <w:jc w:val="left"/>
+        <w:rPr>
+          <w:rFonts w:cs="Times New Roman"/>
+          <w:szCs w:val="20"/>
+        </w:rPr>
+      </w:pPr>
+      <w:r>
+        <w:rPr>
+          <w:rFonts w:cs="Times New Roman"/>
+          <w:szCs w:val="20"/>
+        </w:rPr>
+        <w:tab/>
+        <w:t xml:space="preserve">JOIN TIROCINIO T ON </w:t>
+      </w:r>
+      <w:proofErr w:type="spellStart"/>
+      <w:proofErr w:type="gramStart"/>
+      <w:r>
+        <w:rPr>
+          <w:rFonts w:cs="Times New Roman"/>
+          <w:szCs w:val="20"/>
+        </w:rPr>
+        <w:t>R.ID_Ti</w:t>
+      </w:r>
+      <w:proofErr w:type="spellEnd"/>
+      <w:r>
+        <w:rPr>
+          <w:rFonts w:cs="Times New Roman"/>
+          <w:szCs w:val="20"/>
+        </w:rPr>
+        <w:t>=</w:t>
+      </w:r>
+      <w:proofErr w:type="spellStart"/>
+      <w:r>
+        <w:rPr>
+          <w:rFonts w:cs="Times New Roman"/>
+          <w:szCs w:val="20"/>
+        </w:rPr>
+        <w:t>T.ID</w:t>
+      </w:r>
+      <w:proofErr w:type="gramEnd"/>
+      <w:r>
+        <w:rPr>
+          <w:rFonts w:cs="Times New Roman"/>
+          <w:szCs w:val="20"/>
+        </w:rPr>
+        <w:t>_Ti</w:t>
+      </w:r>
+      <w:proofErr w:type="spellEnd"/>
+    </w:p>
+    <w:p>
+      <w:pPr>
+        <w:ind w:left="0" w:right="192" w:firstLine="0"/>
+        <w:jc w:val="left"/>
+        <w:rPr>
+          <w:rFonts w:cs="Times New Roman"/>
+          <w:szCs w:val="20"/>
+          <w:lang w:val="en-US"/>
+        </w:rPr>
+      </w:pPr>
+      <w:r>
+        <w:rPr>
+          <w:rFonts w:cs="Times New Roman"/>
+          <w:szCs w:val="20"/>
+        </w:rPr>
+        <w:tab/>
+      </w:r>
+      <w:r>
+        <w:rPr>
+          <w:rFonts w:cs="Times New Roman"/>
+          <w:szCs w:val="20"/>
+          <w:lang w:val="en-US"/>
+        </w:rPr>
+        <w:t xml:space="preserve">WHERE </w:t>
+      </w:r>
+      <w:proofErr w:type="spellStart"/>
+      <w:r>
+        <w:rPr>
+          <w:rFonts w:cs="Times New Roman"/>
+          <w:szCs w:val="20"/>
+          <w:lang w:val="en-US"/>
+        </w:rPr>
+        <w:t>Te.ID_Te</w:t>
+      </w:r>
+      <w:proofErr w:type="spellEnd"/>
+      <w:r>
+        <w:rPr>
+          <w:rFonts w:cs="Times New Roman"/>
+          <w:szCs w:val="20"/>
+          <w:lang w:val="en-US"/>
+        </w:rPr>
+        <w:t xml:space="preserve"> = </w:t>
+      </w:r>
+      <w:proofErr w:type="spellStart"/>
+      <w:r>
+        <w:rPr>
+          <w:rFonts w:cs="Times New Roman"/>
+          <w:szCs w:val="20"/>
+          <w:lang w:val="en-US"/>
+        </w:rPr>
+        <w:t>NEW.ID_</w:t>
+      </w:r>
+      <w:proofErr w:type="gramStart"/>
+      <w:r>
+        <w:rPr>
+          <w:rFonts w:cs="Times New Roman"/>
+          <w:szCs w:val="20"/>
+          <w:lang w:val="en-US"/>
+        </w:rPr>
+        <w:t>Te</w:t>
+      </w:r>
+      <w:proofErr w:type="spellEnd"/>
+      <w:r>
+        <w:rPr>
+          <w:rFonts w:cs="Times New Roman"/>
+          <w:szCs w:val="20"/>
+          <w:lang w:val="en-US"/>
+        </w:rPr>
+        <w:t xml:space="preserve"> ;</w:t>
+      </w:r>
+      <w:proofErr w:type="gramEnd"/>
+    </w:p>
+    <w:p>
+      <w:pPr>
+        <w:ind w:left="0" w:right="192" w:firstLine="0"/>
+        <w:jc w:val="left"/>
+        <w:rPr>
+          <w:rFonts w:cs="Times New Roman"/>
+          <w:szCs w:val="20"/>
+          <w:lang w:val="en-US"/>
+        </w:rPr>
+      </w:pPr>
+    </w:p>
+    <w:p>
+      <w:pPr>
+        <w:ind w:left="0" w:right="192" w:firstLine="0"/>
+        <w:jc w:val="left"/>
+        <w:rPr>
+          <w:rFonts w:cs="Times New Roman"/>
+          <w:szCs w:val="20"/>
+        </w:rPr>
+      </w:pPr>
+      <w:r>
+        <w:rPr>
+          <w:rFonts w:cs="Times New Roman"/>
+          <w:szCs w:val="20"/>
+          <w:lang w:val="en-US"/>
+        </w:rPr>
+        <w:tab/>
+      </w:r>
+      <w:r>
+        <w:rPr>
+          <w:rFonts w:cs="Times New Roman"/>
+          <w:szCs w:val="20"/>
+        </w:rPr>
         <w:t xml:space="preserve">IF </w:t>
       </w:r>
+      <w:proofErr w:type="spellStart"/>
+      <w:r>
+        <w:rPr>
+          <w:rFonts w:cs="Times New Roman"/>
+          <w:szCs w:val="20"/>
+        </w:rPr>
+        <w:t>NEW.Data</w:t>
+      </w:r>
+      <w:proofErr w:type="spellEnd"/>
+      <w:r>
+        <w:rPr>
+          <w:rFonts w:cs="Times New Roman"/>
+          <w:szCs w:val="20"/>
+        </w:rPr>
+        <w:t xml:space="preserve"> &lt;= </w:t>
+      </w:r>
+      <w:proofErr w:type="spellStart"/>
+      <w:r>
+        <w:rPr>
+          <w:rFonts w:cs="Times New Roman"/>
+          <w:szCs w:val="20"/>
+        </w:rPr>
+        <w:t>data_tirocinio</w:t>
+      </w:r>
+      <w:proofErr w:type="spellEnd"/>
+      <w:r>
+        <w:rPr>
+          <w:rFonts w:cs="Times New Roman"/>
+          <w:szCs w:val="20"/>
+        </w:rPr>
+        <w:t xml:space="preserve"> THEN</w:t>
+      </w:r>
+    </w:p>
+    <w:p>
+      <w:pPr>
+        <w:ind w:left="0" w:right="192" w:firstLine="0"/>
+        <w:jc w:val="left"/>
+        <w:rPr>
+          <w:rFonts w:cs="Times New Roman"/>
+          <w:szCs w:val="20"/>
+        </w:rPr>
+      </w:pPr>
+      <w:r>
+        <w:rPr>
+          <w:rFonts w:cs="Times New Roman"/>
+          <w:szCs w:val="20"/>
+        </w:rPr>
+        <w:tab/>
+      </w:r>
+      <w:r>
+        <w:rPr>
+          <w:rFonts w:cs="Times New Roman"/>
+          <w:szCs w:val="20"/>
+        </w:rPr>
+        <w:tab/>
+        <w:t>RAISE EXCEPTION 'Seduta precedente rispetto alla richiesta di tirocinio.';</w:t>
+      </w:r>
+    </w:p>
+    <w:p>
+      <w:pPr>
+        <w:ind w:left="0" w:right="192" w:firstLine="0"/>
+        <w:jc w:val="left"/>
+        <w:rPr>
+          <w:rFonts w:cs="Times New Roman"/>
+          <w:szCs w:val="20"/>
+          <w:lang w:val="en-US"/>
+        </w:rPr>
+      </w:pPr>
+      <w:r>
+        <w:rPr>
+          <w:rFonts w:cs="Times New Roman"/>
+          <w:szCs w:val="20"/>
+        </w:rPr>
+        <w:tab/>
+      </w:r>
+      <w:r>
+        <w:rPr>
+          <w:rFonts w:cs="Times New Roman"/>
+          <w:szCs w:val="20"/>
+          <w:lang w:val="en-US"/>
+        </w:rPr>
+        <w:t>END IF;</w:t>
+      </w:r>
+    </w:p>
+    <w:p>
+      <w:pPr>
+        <w:ind w:left="0" w:right="192" w:firstLine="0"/>
+        <w:jc w:val="left"/>
+        <w:rPr>
+          <w:rFonts w:cs="Times New Roman"/>
+          <w:szCs w:val="20"/>
+          <w:lang w:val="en-US"/>
+        </w:rPr>
+      </w:pPr>
+    </w:p>
+    <w:p>
+      <w:pPr>
+        <w:ind w:left="0" w:right="192" w:firstLine="0"/>
+        <w:jc w:val="left"/>
+        <w:rPr>
+          <w:rFonts w:cs="Times New Roman"/>
+          <w:szCs w:val="20"/>
+          <w:lang w:val="en-US"/>
+        </w:rPr>
+      </w:pPr>
+      <w:r>
+        <w:rPr>
+          <w:rFonts w:cs="Times New Roman"/>
+          <w:szCs w:val="20"/>
+          <w:lang w:val="en-US"/>
+        </w:rPr>
+        <w:tab/>
+        <w:t>RETURN NEW;</w:t>
+      </w:r>
+    </w:p>
+    <w:p>
+      <w:pPr>
+        <w:ind w:left="0" w:right="192" w:firstLine="0"/>
+        <w:jc w:val="left"/>
+        <w:rPr>
+          <w:rFonts w:cs="Times New Roman"/>
+          <w:szCs w:val="20"/>
+          <w:lang w:val="en-US"/>
+        </w:rPr>
+      </w:pPr>
+      <w:r>
+        <w:rPr>
+          <w:rFonts w:cs="Times New Roman"/>
+          <w:szCs w:val="20"/>
+          <w:lang w:val="en-US"/>
+        </w:rPr>
+        <w:t>END;</w:t>
+      </w:r>
+      <w:r>
+        <w:rPr>
+          <w:rFonts w:cs="Times New Roman"/>
+          <w:szCs w:val="20"/>
+          <w:lang w:val="en-US"/>
+        </w:rPr>
+        <w:tab/>
+      </w:r>
+    </w:p>
+    <w:p>
+      <w:pPr>
+        <w:ind w:left="0" w:right="192" w:firstLine="0"/>
+        <w:jc w:val="left"/>
+        <w:rPr>
+          <w:rFonts w:cs="Times New Roman"/>
+          <w:szCs w:val="20"/>
+        </w:rPr>
+      </w:pPr>
+      <w:r>
+        <w:rPr>
+          <w:rFonts w:cs="Times New Roman"/>
+          <w:szCs w:val="20"/>
+        </w:rPr>
+        <w:t>$</w:t>
+      </w:r>
+      <w:proofErr w:type="spellStart"/>
+      <w:r>
+        <w:rPr>
+          <w:rFonts w:cs="Times New Roman"/>
+          <w:szCs w:val="20"/>
+        </w:rPr>
+        <w:t>SedutaControlloDataTirocinio</w:t>
+      </w:r>
+      <w:proofErr w:type="spellEnd"/>
+      <w:r>
+        <w:rPr>
+          <w:rFonts w:cs="Times New Roman"/>
+          <w:szCs w:val="20"/>
+        </w:rPr>
+        <w:t xml:space="preserve">$ LANGUAGE </w:t>
+      </w:r>
+      <w:proofErr w:type="spellStart"/>
+      <w:r>
+        <w:rPr>
+          <w:rFonts w:cs="Times New Roman"/>
+          <w:szCs w:val="20"/>
+        </w:rPr>
+        <w:t>plpgsql</w:t>
+      </w:r>
+      <w:proofErr w:type="spellEnd"/>
+      <w:r>
+        <w:rPr>
+          <w:rFonts w:cs="Times New Roman"/>
+          <w:szCs w:val="20"/>
+        </w:rPr>
+        <w:t>;</w:t>
+      </w:r>
+    </w:p>
+    <w:p>
+      <w:pPr>
+        <w:ind w:left="0" w:right="192" w:firstLine="0"/>
+        <w:jc w:val="left"/>
+        <w:rPr>
+          <w:rFonts w:cs="Times New Roman"/>
+          <w:szCs w:val="20"/>
+        </w:rPr>
+      </w:pPr>
+    </w:p>
+    <w:p>
+      <w:pPr>
+        <w:ind w:left="0" w:right="192" w:firstLine="0"/>
+        <w:jc w:val="left"/>
+        <w:rPr>
+          <w:rFonts w:cs="Times New Roman"/>
+          <w:szCs w:val="20"/>
+        </w:rPr>
+      </w:pPr>
+      <w:r>
+        <w:rPr>
+          <w:rFonts w:cs="Times New Roman"/>
+          <w:szCs w:val="20"/>
+        </w:rPr>
+        <w:t xml:space="preserve">CREATE OR REPLACE TRIGGER </w:t>
+      </w:r>
+      <w:proofErr w:type="spellStart"/>
+      <w:r>
+        <w:rPr>
+          <w:rFonts w:cs="Times New Roman"/>
+          <w:szCs w:val="20"/>
+        </w:rPr>
+        <w:t>SedutaControlloDataTirocinioTrigger</w:t>
+      </w:r>
+      <w:proofErr w:type="spellEnd"/>
+    </w:p>
+    <w:p>
+      <w:pPr>
+        <w:ind w:left="0" w:right="192" w:firstLine="0"/>
+        <w:jc w:val="left"/>
+        <w:rPr>
+          <w:rFonts w:cs="Times New Roman"/>
+          <w:szCs w:val="20"/>
+          <w:lang w:val="en-US"/>
+        </w:rPr>
+      </w:pPr>
+      <w:r>
+        <w:rPr>
+          <w:rFonts w:cs="Times New Roman"/>
+          <w:szCs w:val="20"/>
+        </w:rPr>
+        <w:tab/>
+      </w:r>
+      <w:r>
+        <w:rPr>
+          <w:rFonts w:cs="Times New Roman"/>
+          <w:szCs w:val="20"/>
+          <w:lang w:val="en-US"/>
+        </w:rPr>
+        <w:t xml:space="preserve">BEFORE INSERT OR UPDATE ON </w:t>
+      </w:r>
+      <w:proofErr w:type="spellStart"/>
+      <w:r>
+        <w:rPr>
+          <w:rFonts w:cs="Times New Roman"/>
+          <w:szCs w:val="20"/>
+          <w:lang w:val="en-US"/>
+        </w:rPr>
+        <w:t>Seduta</w:t>
+      </w:r>
+      <w:proofErr w:type="spellEnd"/>
+    </w:p>
+    <w:p>
+      <w:pPr>
+        <w:ind w:left="0" w:right="192" w:firstLine="0"/>
+        <w:jc w:val="left"/>
+        <w:rPr>
+          <w:rFonts w:cs="Times New Roman"/>
+          <w:szCs w:val="20"/>
+          <w:lang w:val="en-US"/>
+        </w:rPr>
+      </w:pPr>
+      <w:r>
+        <w:rPr>
+          <w:rFonts w:cs="Times New Roman"/>
+          <w:szCs w:val="20"/>
+          <w:lang w:val="en-US"/>
+        </w:rPr>
+        <w:tab/>
+        <w:t>FOR EACH ROW</w:t>
+      </w:r>
+    </w:p>
+    <w:p>
+      <w:pPr>
+        <w:ind w:left="0" w:right="192" w:firstLine="0"/>
+        <w:jc w:val="left"/>
+        <w:rPr>
+          <w:rFonts w:cs="Times New Roman"/>
+          <w:szCs w:val="20"/>
+          <w:lang w:val="en-US"/>
+        </w:rPr>
+      </w:pPr>
+      <w:r>
+        <w:rPr>
+          <w:rFonts w:cs="Times New Roman"/>
+          <w:szCs w:val="20"/>
+          <w:lang w:val="en-US"/>
+        </w:rPr>
+        <w:t xml:space="preserve">EXECUTE FUNCTION </w:t>
+      </w:r>
+      <w:proofErr w:type="spellStart"/>
       <w:proofErr w:type="gramStart"/>
       <w:r>
         <w:rPr>
@@ -16358,1224 +17893,7 @@
           <w:szCs w:val="20"/>
           <w:lang w:val="en-US"/>
         </w:rPr>
-        <w:t>EXISTS(</w:t>
-      </w:r>
-      <w:proofErr w:type="gramEnd"/>
-    </w:p>
-    <w:p>
-      <w:pPr>
-        <w:ind w:left="0" w:right="192" w:firstLine="0"/>
-        <w:jc w:val="left"/>
-        <w:rPr>
-          <w:rFonts w:cs="Times New Roman"/>
-          <w:szCs w:val="20"/>
-          <w:lang w:val="en-US"/>
-        </w:rPr>
-      </w:pPr>
-      <w:r>
-        <w:rPr>
-          <w:rFonts w:cs="Times New Roman"/>
-          <w:szCs w:val="20"/>
-          <w:lang w:val="en-US"/>
-        </w:rPr>
-        <w:tab/>
-      </w:r>
-      <w:r>
-        <w:rPr>
-          <w:rFonts w:cs="Times New Roman"/>
-          <w:szCs w:val="20"/>
-          <w:lang w:val="en-US"/>
-        </w:rPr>
-        <w:tab/>
-        <w:t>SELECT *</w:t>
-      </w:r>
-    </w:p>
-    <w:p>
-      <w:pPr>
-        <w:ind w:left="0" w:right="192" w:firstLine="0"/>
-        <w:jc w:val="left"/>
-        <w:rPr>
-          <w:rFonts w:cs="Times New Roman"/>
-          <w:szCs w:val="20"/>
-          <w:lang w:val="en-US"/>
-        </w:rPr>
-      </w:pPr>
-      <w:r>
-        <w:rPr>
-          <w:rFonts w:cs="Times New Roman"/>
-          <w:szCs w:val="20"/>
-          <w:lang w:val="en-US"/>
-        </w:rPr>
-        <w:tab/>
-      </w:r>
-      <w:r>
-        <w:rPr>
-          <w:rFonts w:cs="Times New Roman"/>
-          <w:szCs w:val="20"/>
-          <w:lang w:val="en-US"/>
-        </w:rPr>
-        <w:tab/>
-        <w:t>FROM Tesi AS T</w:t>
-      </w:r>
-    </w:p>
-    <w:p>
-      <w:pPr>
-        <w:ind w:left="0" w:right="192" w:firstLine="0"/>
-        <w:jc w:val="left"/>
-        <w:rPr>
-          <w:rFonts w:cs="Times New Roman"/>
-          <w:szCs w:val="20"/>
-          <w:lang w:val="en-US"/>
-        </w:rPr>
-      </w:pPr>
-      <w:r>
-        <w:rPr>
-          <w:rFonts w:cs="Times New Roman"/>
-          <w:szCs w:val="20"/>
-          <w:lang w:val="en-US"/>
-        </w:rPr>
-        <w:tab/>
-      </w:r>
-      <w:r>
-        <w:rPr>
-          <w:rFonts w:cs="Times New Roman"/>
-          <w:szCs w:val="20"/>
-          <w:lang w:val="en-US"/>
-        </w:rPr>
-        <w:tab/>
-        <w:t xml:space="preserve">WHERE </w:t>
-      </w:r>
-      <w:proofErr w:type="spellStart"/>
-      <w:r>
-        <w:rPr>
-          <w:rFonts w:cs="Times New Roman"/>
-          <w:szCs w:val="20"/>
-          <w:lang w:val="en-US"/>
-        </w:rPr>
-        <w:t>T.ID_Te</w:t>
-      </w:r>
-      <w:proofErr w:type="spellEnd"/>
-      <w:r>
-        <w:rPr>
-          <w:rFonts w:cs="Times New Roman"/>
-          <w:szCs w:val="20"/>
-          <w:lang w:val="en-US"/>
-        </w:rPr>
-        <w:t xml:space="preserve"> &lt;&gt; </w:t>
-      </w:r>
-      <w:proofErr w:type="spellStart"/>
-      <w:r>
-        <w:rPr>
-          <w:rFonts w:cs="Times New Roman"/>
-          <w:szCs w:val="20"/>
-          <w:lang w:val="en-US"/>
-        </w:rPr>
-        <w:t>NEW.ID_Te</w:t>
-      </w:r>
-      <w:proofErr w:type="spellEnd"/>
-      <w:r>
-        <w:rPr>
-          <w:rFonts w:cs="Times New Roman"/>
-          <w:szCs w:val="20"/>
-          <w:lang w:val="en-US"/>
-        </w:rPr>
-        <w:t xml:space="preserve"> AND </w:t>
-      </w:r>
-      <w:proofErr w:type="spellStart"/>
-      <w:proofErr w:type="gramStart"/>
-      <w:r>
-        <w:rPr>
-          <w:rFonts w:cs="Times New Roman"/>
-          <w:szCs w:val="20"/>
-          <w:lang w:val="en-US"/>
-        </w:rPr>
-        <w:t>T.Contenuto</w:t>
-      </w:r>
-      <w:proofErr w:type="spellEnd"/>
-      <w:proofErr w:type="gramEnd"/>
-      <w:r>
-        <w:rPr>
-          <w:rFonts w:cs="Times New Roman"/>
-          <w:szCs w:val="20"/>
-          <w:lang w:val="en-US"/>
-        </w:rPr>
-        <w:t xml:space="preserve"> = </w:t>
-      </w:r>
-      <w:proofErr w:type="spellStart"/>
-      <w:r>
-        <w:rPr>
-          <w:rFonts w:cs="Times New Roman"/>
-          <w:szCs w:val="20"/>
-          <w:lang w:val="en-US"/>
-        </w:rPr>
-        <w:t>NEW.Contenuto</w:t>
-      </w:r>
-      <w:proofErr w:type="spellEnd"/>
-    </w:p>
-    <w:p>
-      <w:pPr>
-        <w:ind w:left="0" w:right="192" w:firstLine="0"/>
-        <w:jc w:val="left"/>
-        <w:rPr>
-          <w:rFonts w:cs="Times New Roman"/>
-          <w:szCs w:val="20"/>
-        </w:rPr>
-      </w:pPr>
-      <w:r>
-        <w:rPr>
-          <w:rFonts w:cs="Times New Roman"/>
-          <w:szCs w:val="20"/>
-          <w:lang w:val="en-US"/>
-        </w:rPr>
-        <w:tab/>
-      </w:r>
-      <w:r>
-        <w:rPr>
-          <w:rFonts w:cs="Times New Roman"/>
-          <w:szCs w:val="20"/>
-        </w:rPr>
-        <w:t>)</w:t>
-      </w:r>
-    </w:p>
-    <w:p>
-      <w:pPr>
-        <w:ind w:left="0" w:right="192" w:firstLine="0"/>
-        <w:jc w:val="left"/>
-        <w:rPr>
-          <w:rFonts w:cs="Times New Roman"/>
-          <w:szCs w:val="20"/>
-        </w:rPr>
-      </w:pPr>
-      <w:r>
-        <w:rPr>
-          <w:rFonts w:cs="Times New Roman"/>
-          <w:szCs w:val="20"/>
-        </w:rPr>
-        <w:tab/>
-        <w:t>THEN RAISE EXCEPTION 'Tesi già esistente sotto altro ID e altra richiesta';</w:t>
-      </w:r>
-    </w:p>
-    <w:p>
-      <w:pPr>
-        <w:ind w:left="0" w:right="192" w:firstLine="0"/>
-        <w:jc w:val="left"/>
-        <w:rPr>
-          <w:rFonts w:cs="Times New Roman"/>
-          <w:szCs w:val="20"/>
-          <w:lang w:val="en-US"/>
-        </w:rPr>
-      </w:pPr>
-      <w:r>
-        <w:rPr>
-          <w:rFonts w:cs="Times New Roman"/>
-          <w:szCs w:val="20"/>
-        </w:rPr>
-        <w:tab/>
-      </w:r>
-      <w:r>
-        <w:rPr>
-          <w:rFonts w:cs="Times New Roman"/>
-          <w:szCs w:val="20"/>
-          <w:lang w:val="en-US"/>
-        </w:rPr>
-        <w:t>END IF;</w:t>
-      </w:r>
-    </w:p>
-    <w:p>
-      <w:pPr>
-        <w:ind w:left="0" w:right="192" w:firstLine="0"/>
-        <w:jc w:val="left"/>
-        <w:rPr>
-          <w:rFonts w:cs="Times New Roman"/>
-          <w:szCs w:val="20"/>
-          <w:lang w:val="en-US"/>
-        </w:rPr>
-      </w:pPr>
-      <w:r>
-        <w:rPr>
-          <w:rFonts w:cs="Times New Roman"/>
-          <w:szCs w:val="20"/>
-          <w:lang w:val="en-US"/>
-        </w:rPr>
-        <w:tab/>
-        <w:t>RETURN NEW;</w:t>
-      </w:r>
-    </w:p>
-    <w:p>
-      <w:pPr>
-        <w:ind w:left="0" w:right="192" w:firstLine="0"/>
-        <w:jc w:val="left"/>
-        <w:rPr>
-          <w:rFonts w:cs="Times New Roman"/>
-          <w:szCs w:val="20"/>
-          <w:lang w:val="en-US"/>
-        </w:rPr>
-      </w:pPr>
-      <w:r>
-        <w:rPr>
-          <w:rFonts w:cs="Times New Roman"/>
-          <w:szCs w:val="20"/>
-          <w:lang w:val="en-US"/>
-        </w:rPr>
-        <w:t>END;</w:t>
-      </w:r>
-    </w:p>
-    <w:p>
-      <w:pPr>
-        <w:ind w:left="0" w:right="192" w:firstLine="0"/>
-        <w:jc w:val="left"/>
-        <w:rPr>
-          <w:rFonts w:cs="Times New Roman"/>
-          <w:szCs w:val="20"/>
-          <w:lang w:val="en-US"/>
-        </w:rPr>
-      </w:pPr>
-      <w:r>
-        <w:rPr>
-          <w:rFonts w:cs="Times New Roman"/>
-          <w:szCs w:val="20"/>
-          <w:lang w:val="en-US"/>
-        </w:rPr>
-        <w:t>$</w:t>
-      </w:r>
-      <w:proofErr w:type="spellStart"/>
-      <w:r>
-        <w:rPr>
-          <w:rFonts w:cs="Times New Roman"/>
-          <w:szCs w:val="20"/>
-          <w:lang w:val="en-US"/>
-        </w:rPr>
-        <w:t>TesiUnique</w:t>
-      </w:r>
-      <w:proofErr w:type="spellEnd"/>
-      <w:r>
-        <w:rPr>
-          <w:rFonts w:cs="Times New Roman"/>
-          <w:szCs w:val="20"/>
-          <w:lang w:val="en-US"/>
-        </w:rPr>
-        <w:t xml:space="preserve">$ LANGUAGE </w:t>
-      </w:r>
-      <w:proofErr w:type="spellStart"/>
-      <w:r>
-        <w:rPr>
-          <w:rFonts w:cs="Times New Roman"/>
-          <w:szCs w:val="20"/>
-          <w:lang w:val="en-US"/>
-        </w:rPr>
-        <w:t>plpgsql</w:t>
-      </w:r>
-      <w:proofErr w:type="spellEnd"/>
-      <w:r>
-        <w:rPr>
-          <w:rFonts w:cs="Times New Roman"/>
-          <w:szCs w:val="20"/>
-          <w:lang w:val="en-US"/>
-        </w:rPr>
-        <w:t>;</w:t>
-      </w:r>
-    </w:p>
-    <w:p>
-      <w:pPr>
-        <w:ind w:left="0" w:right="192" w:firstLine="0"/>
-        <w:jc w:val="left"/>
-        <w:rPr>
-          <w:rFonts w:cs="Times New Roman"/>
-          <w:szCs w:val="20"/>
-          <w:lang w:val="en-US"/>
-        </w:rPr>
-      </w:pPr>
-    </w:p>
-    <w:p>
-      <w:pPr>
-        <w:ind w:left="0" w:right="192" w:firstLine="0"/>
-        <w:jc w:val="left"/>
-        <w:rPr>
-          <w:rFonts w:cs="Times New Roman"/>
-          <w:szCs w:val="20"/>
-          <w:lang w:val="en-US"/>
-        </w:rPr>
-      </w:pPr>
-      <w:r>
-        <w:rPr>
-          <w:rFonts w:cs="Times New Roman"/>
-          <w:szCs w:val="20"/>
-          <w:lang w:val="en-US"/>
-        </w:rPr>
-        <w:t xml:space="preserve">CREATE OR REPLACE TRIGGER </w:t>
-      </w:r>
-      <w:proofErr w:type="spellStart"/>
-      <w:r>
-        <w:rPr>
-          <w:rFonts w:cs="Times New Roman"/>
-          <w:szCs w:val="20"/>
-          <w:lang w:val="en-US"/>
-        </w:rPr>
-        <w:t>TesiUniqueTrigger</w:t>
-      </w:r>
-      <w:proofErr w:type="spellEnd"/>
-    </w:p>
-    <w:p>
-      <w:pPr>
-        <w:ind w:left="0" w:right="192" w:firstLine="0"/>
-        <w:jc w:val="left"/>
-        <w:rPr>
-          <w:rFonts w:cs="Times New Roman"/>
-          <w:szCs w:val="20"/>
-          <w:lang w:val="en-US"/>
-        </w:rPr>
-      </w:pPr>
-      <w:r>
-        <w:rPr>
-          <w:rFonts w:cs="Times New Roman"/>
-          <w:szCs w:val="20"/>
-          <w:lang w:val="en-US"/>
-        </w:rPr>
-        <w:tab/>
-        <w:t>BEFORE INSERT OR UPDATE ON Tesi</w:t>
-      </w:r>
-    </w:p>
-    <w:p>
-      <w:pPr>
-        <w:ind w:left="0" w:right="192" w:firstLine="0"/>
-        <w:jc w:val="left"/>
-        <w:rPr>
-          <w:rFonts w:cs="Times New Roman"/>
-          <w:szCs w:val="20"/>
-          <w:lang w:val="en-US"/>
-        </w:rPr>
-      </w:pPr>
-      <w:r>
-        <w:rPr>
-          <w:rFonts w:cs="Times New Roman"/>
-          <w:szCs w:val="20"/>
-          <w:lang w:val="en-US"/>
-        </w:rPr>
-        <w:tab/>
-        <w:t xml:space="preserve">FOR EACH ROW </w:t>
-      </w:r>
-    </w:p>
-    <w:p>
-      <w:pPr>
-        <w:ind w:left="0" w:right="192" w:firstLine="0"/>
-        <w:jc w:val="left"/>
-        <w:rPr>
-          <w:rFonts w:cs="Times New Roman"/>
-          <w:szCs w:val="20"/>
-          <w:lang w:val="en-US"/>
-        </w:rPr>
-      </w:pPr>
-      <w:r>
-        <w:rPr>
-          <w:rFonts w:cs="Times New Roman"/>
-          <w:szCs w:val="20"/>
-          <w:lang w:val="en-US"/>
-        </w:rPr>
-        <w:t xml:space="preserve">EXECUTE FUNCTION </w:t>
-      </w:r>
-      <w:proofErr w:type="spellStart"/>
-      <w:proofErr w:type="gramStart"/>
-      <w:r>
-        <w:rPr>
-          <w:rFonts w:cs="Times New Roman"/>
-          <w:szCs w:val="20"/>
-          <w:lang w:val="en-US"/>
-        </w:rPr>
-        <w:t>TesiUnique</w:t>
-      </w:r>
-      <w:proofErr w:type="spellEnd"/>
-      <w:r>
-        <w:rPr>
-          <w:rFonts w:cs="Times New Roman"/>
-          <w:szCs w:val="20"/>
-          <w:lang w:val="en-US"/>
-        </w:rPr>
-        <w:t>(</w:t>
-      </w:r>
-      <w:proofErr w:type="gramEnd"/>
-      <w:r>
-        <w:rPr>
-          <w:rFonts w:cs="Times New Roman"/>
-          <w:szCs w:val="20"/>
-          <w:lang w:val="en-US"/>
-        </w:rPr>
-        <w:t>);</w:t>
-      </w:r>
-    </w:p>
-    <w:p>
-      <w:pPr>
-        <w:ind w:left="0" w:right="192" w:firstLine="0"/>
-        <w:jc w:val="left"/>
-        <w:rPr>
-          <w:rFonts w:cs="Times New Roman"/>
-          <w:szCs w:val="20"/>
-          <w:lang w:val="en-US"/>
-        </w:rPr>
-      </w:pPr>
-    </w:p>
-    <w:p>
-      <w:pPr>
-        <w:ind w:left="0" w:right="192" w:firstLine="0"/>
-        <w:jc w:val="left"/>
-        <w:rPr>
-          <w:rFonts w:cs="Times New Roman"/>
-          <w:szCs w:val="20"/>
-          <w:lang w:val="en-US"/>
-        </w:rPr>
-      </w:pPr>
-    </w:p>
-    <w:p>
-      <w:pPr>
-        <w:ind w:left="0" w:right="192" w:firstLine="0"/>
-        <w:jc w:val="left"/>
-        <w:rPr>
-          <w:rFonts w:cs="Times New Roman"/>
-          <w:szCs w:val="20"/>
-          <w:lang w:val="en-US"/>
-        </w:rPr>
-      </w:pPr>
-    </w:p>
-    <w:p>
-      <w:pPr>
-        <w:ind w:left="0" w:right="192" w:firstLine="0"/>
-        <w:jc w:val="left"/>
-        <w:rPr>
-          <w:rFonts w:cs="Times New Roman"/>
-          <w:szCs w:val="20"/>
-          <w:lang w:val="en-US"/>
-        </w:rPr>
-      </w:pPr>
-    </w:p>
-    <w:p>
-      <w:pPr>
-        <w:ind w:left="0" w:right="192" w:firstLine="0"/>
-        <w:jc w:val="left"/>
-        <w:rPr>
-          <w:rFonts w:cs="Times New Roman"/>
-          <w:szCs w:val="20"/>
-          <w:lang w:val="en-US"/>
-        </w:rPr>
-      </w:pPr>
-    </w:p>
-    <w:p>
-      <w:pPr>
-        <w:ind w:left="0" w:right="192" w:firstLine="0"/>
-        <w:jc w:val="left"/>
-        <w:rPr>
-          <w:rFonts w:cs="Times New Roman"/>
-          <w:szCs w:val="20"/>
-          <w:lang w:val="en-US"/>
-        </w:rPr>
-      </w:pPr>
-    </w:p>
-    <w:p>
-      <w:pPr>
-        <w:ind w:left="0" w:right="192" w:firstLine="0"/>
-        <w:jc w:val="left"/>
-        <w:rPr>
-          <w:rFonts w:cs="Times New Roman"/>
-          <w:szCs w:val="20"/>
-          <w:lang w:val="en-US"/>
-        </w:rPr>
-      </w:pPr>
-    </w:p>
-    <w:p>
-      <w:pPr>
-        <w:ind w:left="0" w:right="192" w:firstLine="0"/>
-        <w:jc w:val="left"/>
-        <w:rPr>
-          <w:rFonts w:cs="Times New Roman"/>
-          <w:szCs w:val="20"/>
-          <w:lang w:val="en-US"/>
-        </w:rPr>
-      </w:pPr>
-    </w:p>
-    <w:p>
-      <w:pPr>
-        <w:ind w:left="0" w:right="192" w:firstLine="0"/>
-        <w:jc w:val="left"/>
-        <w:rPr>
-          <w:rFonts w:cs="Times New Roman"/>
-          <w:szCs w:val="20"/>
-          <w:lang w:val="en-US"/>
-        </w:rPr>
-      </w:pPr>
-    </w:p>
-    <w:p>
-      <w:pPr>
-        <w:ind w:left="0" w:right="192" w:firstLine="0"/>
-        <w:jc w:val="left"/>
-        <w:rPr>
-          <w:rFonts w:cs="Times New Roman"/>
-          <w:szCs w:val="20"/>
-          <w:lang w:val="en-US"/>
-        </w:rPr>
-      </w:pPr>
-    </w:p>
-    <w:p>
-      <w:pPr>
-        <w:ind w:left="0" w:right="192" w:firstLine="0"/>
-        <w:jc w:val="left"/>
-        <w:rPr>
-          <w:rFonts w:cs="Times New Roman"/>
-          <w:szCs w:val="20"/>
-          <w:lang w:val="en-US"/>
-        </w:rPr>
-      </w:pPr>
-    </w:p>
-    <w:p>
-      <w:pPr>
-        <w:ind w:left="0" w:right="192" w:firstLine="0"/>
-        <w:jc w:val="left"/>
-        <w:rPr>
-          <w:rFonts w:cs="Times New Roman"/>
-          <w:szCs w:val="20"/>
-          <w:lang w:val="en-US"/>
-        </w:rPr>
-      </w:pPr>
-    </w:p>
-    <w:p>
-      <w:pPr>
-        <w:ind w:left="0" w:right="192" w:firstLine="0"/>
-        <w:jc w:val="left"/>
-        <w:rPr>
-          <w:rFonts w:cs="Times New Roman"/>
-          <w:szCs w:val="20"/>
-          <w:lang w:val="en-US"/>
-        </w:rPr>
-      </w:pPr>
-    </w:p>
-    <w:p>
-      <w:pPr>
-        <w:ind w:left="0" w:right="192" w:firstLine="0"/>
-        <w:jc w:val="left"/>
-        <w:rPr>
-          <w:rFonts w:cs="Times New Roman"/>
-          <w:szCs w:val="20"/>
-          <w:lang w:val="en-US"/>
-        </w:rPr>
-      </w:pPr>
-    </w:p>
-    <w:p>
-      <w:pPr>
-        <w:ind w:left="0" w:right="192" w:firstLine="0"/>
-        <w:jc w:val="left"/>
-        <w:rPr>
-          <w:rFonts w:cs="Times New Roman"/>
-          <w:szCs w:val="20"/>
-          <w:lang w:val="en-US"/>
-        </w:rPr>
-      </w:pPr>
-    </w:p>
-    <w:p>
-      <w:pPr>
-        <w:ind w:left="0" w:right="192" w:firstLine="0"/>
-        <w:jc w:val="left"/>
-        <w:rPr>
-          <w:rFonts w:cs="Times New Roman"/>
-          <w:szCs w:val="20"/>
-          <w:lang w:val="en-US"/>
-        </w:rPr>
-      </w:pPr>
-    </w:p>
-    <w:p>
-      <w:pPr>
-        <w:ind w:left="0" w:right="192" w:firstLine="0"/>
-        <w:jc w:val="left"/>
-        <w:rPr>
-          <w:rFonts w:cs="Times New Roman"/>
-          <w:szCs w:val="20"/>
-          <w:lang w:val="en-US"/>
-        </w:rPr>
-      </w:pPr>
-    </w:p>
-    <w:p>
-      <w:pPr>
-        <w:ind w:left="0" w:right="192" w:firstLine="0"/>
-        <w:jc w:val="left"/>
-        <w:rPr>
-          <w:rFonts w:cs="Times New Roman"/>
-          <w:szCs w:val="20"/>
-          <w:lang w:val="en-US"/>
-        </w:rPr>
-      </w:pPr>
-    </w:p>
-    <w:p>
-      <w:pPr>
-        <w:ind w:left="0" w:right="192" w:firstLine="0"/>
-        <w:jc w:val="left"/>
-        <w:rPr>
-          <w:rFonts w:cs="Times New Roman"/>
-          <w:b/>
-          <w:bCs/>
-          <w:szCs w:val="20"/>
-          <w:lang w:val="en-US"/>
-        </w:rPr>
-      </w:pPr>
-    </w:p>
-    <w:p>
-      <w:pPr>
-        <w:ind w:left="0" w:right="192" w:firstLine="0"/>
-        <w:jc w:val="left"/>
-        <w:rPr>
-          <w:rFonts w:cs="Times New Roman"/>
-          <w:b/>
-          <w:bCs/>
-          <w:szCs w:val="20"/>
-          <w:lang w:val="en-US"/>
-        </w:rPr>
-      </w:pPr>
-      <w:r>
-        <w:rPr>
-          <w:rFonts w:cs="Times New Roman"/>
-          <w:b/>
-          <w:bCs/>
-          <w:szCs w:val="20"/>
-          <w:lang w:val="en-US"/>
-        </w:rPr>
-        <w:lastRenderedPageBreak/>
-        <w:t xml:space="preserve">5.2.11 </w:t>
-      </w:r>
-      <w:proofErr w:type="spellStart"/>
-      <w:r>
-        <w:rPr>
-          <w:rFonts w:cs="Times New Roman"/>
-          <w:b/>
-          <w:bCs/>
-          <w:szCs w:val="20"/>
-          <w:lang w:val="en-US"/>
-        </w:rPr>
-        <w:t>SedutaAggiungiVotoSuTesi</w:t>
-      </w:r>
-      <w:proofErr w:type="spellEnd"/>
-    </w:p>
-    <w:p>
-      <w:pPr>
-        <w:ind w:left="0" w:right="192" w:firstLine="0"/>
-        <w:jc w:val="left"/>
-        <w:rPr>
-          <w:rFonts w:cs="Times New Roman"/>
-          <w:b/>
-          <w:bCs/>
-          <w:szCs w:val="20"/>
-          <w:lang w:val="en-US"/>
-        </w:rPr>
-      </w:pPr>
-    </w:p>
-    <w:p>
-      <w:pPr>
-        <w:ind w:left="0" w:right="192" w:firstLine="0"/>
-        <w:jc w:val="left"/>
-        <w:rPr>
-          <w:rFonts w:cs="Times New Roman"/>
-          <w:szCs w:val="20"/>
-          <w:lang w:val="en-US"/>
-        </w:rPr>
-      </w:pPr>
-      <w:r>
-        <w:rPr>
-          <w:rFonts w:cs="Times New Roman"/>
-          <w:szCs w:val="20"/>
-          <w:lang w:val="en-US"/>
-        </w:rPr>
-        <w:t xml:space="preserve">CREATE OR REPLACE FUNCTION </w:t>
-      </w:r>
-      <w:proofErr w:type="spellStart"/>
-      <w:proofErr w:type="gramStart"/>
-      <w:r>
-        <w:rPr>
-          <w:rFonts w:cs="Times New Roman"/>
-          <w:szCs w:val="20"/>
-          <w:lang w:val="en-US"/>
-        </w:rPr>
-        <w:t>SedutaAggiungiVotoSuTesi</w:t>
-      </w:r>
-      <w:proofErr w:type="spellEnd"/>
-      <w:r>
-        <w:rPr>
-          <w:rFonts w:cs="Times New Roman"/>
-          <w:szCs w:val="20"/>
-          <w:lang w:val="en-US"/>
-        </w:rPr>
-        <w:t>(</w:t>
-      </w:r>
-      <w:proofErr w:type="gramEnd"/>
-      <w:r>
-        <w:rPr>
-          <w:rFonts w:cs="Times New Roman"/>
-          <w:szCs w:val="20"/>
-          <w:lang w:val="en-US"/>
-        </w:rPr>
-        <w:t>)</w:t>
-      </w:r>
-    </w:p>
-    <w:p>
-      <w:pPr>
-        <w:ind w:left="0" w:right="192" w:firstLine="0"/>
-        <w:jc w:val="left"/>
-        <w:rPr>
-          <w:rFonts w:cs="Times New Roman"/>
-          <w:szCs w:val="20"/>
-          <w:lang w:val="en-US"/>
-        </w:rPr>
-      </w:pPr>
-      <w:r>
-        <w:rPr>
-          <w:rFonts w:cs="Times New Roman"/>
-          <w:szCs w:val="20"/>
-          <w:lang w:val="en-US"/>
-        </w:rPr>
-        <w:tab/>
-        <w:t>RETURNS trigger AS</w:t>
-      </w:r>
-    </w:p>
-    <w:p>
-      <w:pPr>
-        <w:ind w:left="0" w:right="192" w:firstLine="0"/>
-        <w:jc w:val="left"/>
-        <w:rPr>
-          <w:rFonts w:cs="Times New Roman"/>
-          <w:szCs w:val="20"/>
-          <w:lang w:val="en-US"/>
-        </w:rPr>
-      </w:pPr>
-      <w:r>
-        <w:rPr>
-          <w:rFonts w:cs="Times New Roman"/>
-          <w:szCs w:val="20"/>
-          <w:lang w:val="en-US"/>
-        </w:rPr>
-        <w:t>$</w:t>
-      </w:r>
-      <w:proofErr w:type="spellStart"/>
-      <w:r>
-        <w:rPr>
-          <w:rFonts w:cs="Times New Roman"/>
-          <w:szCs w:val="20"/>
-          <w:lang w:val="en-US"/>
-        </w:rPr>
-        <w:t>SedutaAggiungiVotoSuTesi</w:t>
-      </w:r>
-      <w:proofErr w:type="spellEnd"/>
-      <w:r>
-        <w:rPr>
-          <w:rFonts w:cs="Times New Roman"/>
-          <w:szCs w:val="20"/>
-          <w:lang w:val="en-US"/>
-        </w:rPr>
-        <w:t>$</w:t>
-      </w:r>
-    </w:p>
-    <w:p>
-      <w:pPr>
-        <w:ind w:left="0" w:right="192" w:firstLine="0"/>
-        <w:jc w:val="left"/>
-        <w:rPr>
-          <w:rFonts w:cs="Times New Roman"/>
-          <w:szCs w:val="20"/>
-          <w:lang w:val="en-US"/>
-        </w:rPr>
-      </w:pPr>
-      <w:r>
-        <w:rPr>
-          <w:rFonts w:cs="Times New Roman"/>
-          <w:szCs w:val="20"/>
-          <w:lang w:val="en-US"/>
-        </w:rPr>
-        <w:t>BEGIN</w:t>
-      </w:r>
-    </w:p>
-    <w:p>
-      <w:pPr>
-        <w:ind w:left="0" w:right="192" w:firstLine="0"/>
-        <w:jc w:val="left"/>
-        <w:rPr>
-          <w:rFonts w:cs="Times New Roman"/>
-          <w:szCs w:val="20"/>
-          <w:lang w:val="en-US"/>
-        </w:rPr>
-      </w:pPr>
-      <w:r>
-        <w:rPr>
-          <w:rFonts w:cs="Times New Roman"/>
-          <w:szCs w:val="20"/>
-          <w:lang w:val="en-US"/>
-        </w:rPr>
-        <w:tab/>
-        <w:t xml:space="preserve">IF </w:t>
-      </w:r>
-      <w:proofErr w:type="gramStart"/>
-      <w:r>
-        <w:rPr>
-          <w:rFonts w:cs="Times New Roman"/>
-          <w:szCs w:val="20"/>
-          <w:lang w:val="en-US"/>
-        </w:rPr>
-        <w:t>ISNOTNULL(</w:t>
-      </w:r>
-      <w:proofErr w:type="spellStart"/>
-      <w:proofErr w:type="gramEnd"/>
-      <w:r>
-        <w:rPr>
-          <w:rFonts w:cs="Times New Roman"/>
-          <w:szCs w:val="20"/>
-          <w:lang w:val="en-US"/>
-        </w:rPr>
-        <w:t>NEW.VotoFinale</w:t>
-      </w:r>
-      <w:proofErr w:type="spellEnd"/>
-      <w:r>
-        <w:rPr>
-          <w:rFonts w:cs="Times New Roman"/>
-          <w:szCs w:val="20"/>
-          <w:lang w:val="en-US"/>
-        </w:rPr>
-        <w:t>) AND ISNULL(</w:t>
-      </w:r>
-      <w:proofErr w:type="spellStart"/>
-      <w:r>
-        <w:rPr>
-          <w:rFonts w:cs="Times New Roman"/>
-          <w:szCs w:val="20"/>
-          <w:lang w:val="en-US"/>
-        </w:rPr>
-        <w:t>NEW.ID_Te</w:t>
-      </w:r>
-      <w:proofErr w:type="spellEnd"/>
-      <w:r>
-        <w:rPr>
-          <w:rFonts w:cs="Times New Roman"/>
-          <w:szCs w:val="20"/>
-          <w:lang w:val="en-US"/>
-        </w:rPr>
-        <w:t>)</w:t>
-      </w:r>
-    </w:p>
-    <w:p>
-      <w:pPr>
-        <w:ind w:left="0" w:right="192" w:firstLine="0"/>
-        <w:jc w:val="left"/>
-        <w:rPr>
-          <w:rFonts w:cs="Times New Roman"/>
-          <w:szCs w:val="20"/>
-          <w:lang w:val="en-US"/>
-        </w:rPr>
-      </w:pPr>
-      <w:r>
-        <w:rPr>
-          <w:rFonts w:cs="Times New Roman"/>
-          <w:szCs w:val="20"/>
-          <w:lang w:val="en-US"/>
-        </w:rPr>
-        <w:tab/>
-      </w:r>
-      <w:r>
-        <w:rPr>
-          <w:rFonts w:cs="Times New Roman"/>
-          <w:szCs w:val="20"/>
-          <w:lang w:val="en-US"/>
-        </w:rPr>
-        <w:tab/>
-        <w:t xml:space="preserve">THEN RAISE EXCEPTION 'Tesi </w:t>
-      </w:r>
-      <w:proofErr w:type="spellStart"/>
-      <w:r>
-        <w:rPr>
-          <w:rFonts w:cs="Times New Roman"/>
-          <w:szCs w:val="20"/>
-          <w:lang w:val="en-US"/>
-        </w:rPr>
-        <w:t>mancante</w:t>
-      </w:r>
-      <w:proofErr w:type="spellEnd"/>
-      <w:r>
-        <w:rPr>
-          <w:rFonts w:cs="Times New Roman"/>
-          <w:szCs w:val="20"/>
-          <w:lang w:val="en-US"/>
-        </w:rPr>
-        <w:t xml:space="preserve"> per </w:t>
-      </w:r>
-      <w:proofErr w:type="spellStart"/>
-      <w:r>
-        <w:rPr>
-          <w:rFonts w:cs="Times New Roman"/>
-          <w:szCs w:val="20"/>
-          <w:lang w:val="en-US"/>
-        </w:rPr>
-        <w:t>voto</w:t>
-      </w:r>
-      <w:proofErr w:type="spellEnd"/>
-      <w:r>
-        <w:rPr>
-          <w:rFonts w:cs="Times New Roman"/>
-          <w:szCs w:val="20"/>
-          <w:lang w:val="en-US"/>
-        </w:rPr>
-        <w:t>'</w:t>
-      </w:r>
-      <w:r>
-        <w:rPr>
-          <w:rFonts w:cs="Times New Roman"/>
-          <w:szCs w:val="20"/>
-          <w:lang w:val="en-US"/>
-        </w:rPr>
-        <w:t>;</w:t>
-      </w:r>
-    </w:p>
-    <w:p>
-      <w:pPr>
-        <w:ind w:left="0" w:right="192" w:firstLine="0"/>
-        <w:jc w:val="left"/>
-        <w:rPr>
-          <w:rFonts w:cs="Times New Roman"/>
-          <w:szCs w:val="20"/>
-          <w:lang w:val="en-US"/>
-        </w:rPr>
-      </w:pPr>
-      <w:r>
-        <w:rPr>
-          <w:rFonts w:cs="Times New Roman"/>
-          <w:szCs w:val="20"/>
-          <w:lang w:val="en-US"/>
-        </w:rPr>
-        <w:tab/>
-        <w:t>END</w:t>
-      </w:r>
-      <w:r>
-        <w:rPr>
-          <w:rFonts w:cs="Times New Roman"/>
-          <w:szCs w:val="20"/>
-          <w:lang w:val="en-US"/>
-        </w:rPr>
-        <w:t xml:space="preserve"> </w:t>
-      </w:r>
-      <w:r>
-        <w:rPr>
-          <w:rFonts w:cs="Times New Roman"/>
-          <w:szCs w:val="20"/>
-          <w:lang w:val="en-US"/>
-        </w:rPr>
-        <w:t>IF;</w:t>
-      </w:r>
-    </w:p>
-    <w:p>
-      <w:pPr>
-        <w:ind w:left="0" w:right="192" w:firstLine="0"/>
-        <w:jc w:val="left"/>
-        <w:rPr>
-          <w:rFonts w:cs="Times New Roman"/>
-          <w:szCs w:val="20"/>
-          <w:lang w:val="en-US"/>
-        </w:rPr>
-      </w:pPr>
-      <w:r>
-        <w:rPr>
-          <w:rFonts w:cs="Times New Roman"/>
-          <w:szCs w:val="20"/>
-          <w:lang w:val="en-US"/>
-        </w:rPr>
-        <w:tab/>
-        <w:t>RETURN NEW;</w:t>
-      </w:r>
-    </w:p>
-    <w:p>
-      <w:pPr>
-        <w:ind w:left="0" w:right="192" w:firstLine="0"/>
-        <w:jc w:val="left"/>
-        <w:rPr>
-          <w:rFonts w:cs="Times New Roman"/>
-          <w:szCs w:val="20"/>
-          <w:lang w:val="en-US"/>
-        </w:rPr>
-      </w:pPr>
-      <w:r>
-        <w:rPr>
-          <w:rFonts w:cs="Times New Roman"/>
-          <w:szCs w:val="20"/>
-          <w:lang w:val="en-US"/>
-        </w:rPr>
-        <w:t>END</w:t>
-      </w:r>
-    </w:p>
-    <w:p>
-      <w:pPr>
-        <w:ind w:left="0" w:right="192" w:firstLine="0"/>
-        <w:jc w:val="left"/>
-        <w:rPr>
-          <w:rFonts w:cs="Times New Roman"/>
-          <w:szCs w:val="20"/>
-          <w:lang w:val="en-US"/>
-        </w:rPr>
-      </w:pPr>
-      <w:r>
-        <w:rPr>
-          <w:rFonts w:cs="Times New Roman"/>
-          <w:szCs w:val="20"/>
-          <w:lang w:val="en-US"/>
-        </w:rPr>
-        <w:t>$</w:t>
-      </w:r>
-      <w:proofErr w:type="spellStart"/>
-      <w:r>
-        <w:rPr>
-          <w:rFonts w:cs="Times New Roman"/>
-          <w:szCs w:val="20"/>
-          <w:lang w:val="en-US"/>
-        </w:rPr>
-        <w:t>SedutaAggiungiVotoSuTesi</w:t>
-      </w:r>
-      <w:proofErr w:type="spellEnd"/>
-      <w:r>
-        <w:rPr>
-          <w:rFonts w:cs="Times New Roman"/>
-          <w:szCs w:val="20"/>
-          <w:lang w:val="en-US"/>
-        </w:rPr>
-        <w:t xml:space="preserve">$ LANGUAGE </w:t>
-      </w:r>
-      <w:proofErr w:type="spellStart"/>
-      <w:r>
-        <w:rPr>
-          <w:rFonts w:cs="Times New Roman"/>
-          <w:szCs w:val="20"/>
-          <w:lang w:val="en-US"/>
-        </w:rPr>
-        <w:t>plpgsql</w:t>
-      </w:r>
-      <w:proofErr w:type="spellEnd"/>
-      <w:r>
-        <w:rPr>
-          <w:rFonts w:cs="Times New Roman"/>
-          <w:szCs w:val="20"/>
-          <w:lang w:val="en-US"/>
-        </w:rPr>
-        <w:t>;</w:t>
-      </w:r>
-    </w:p>
-    <w:p>
-      <w:pPr>
-        <w:ind w:left="0" w:right="192" w:firstLine="0"/>
-        <w:jc w:val="left"/>
-        <w:rPr>
-          <w:rFonts w:cs="Times New Roman"/>
-          <w:szCs w:val="20"/>
-          <w:lang w:val="en-US"/>
-        </w:rPr>
-      </w:pPr>
-    </w:p>
-    <w:p>
-      <w:pPr>
-        <w:ind w:left="0" w:right="192" w:firstLine="0"/>
-        <w:jc w:val="left"/>
-        <w:rPr>
-          <w:rFonts w:cs="Times New Roman"/>
-          <w:szCs w:val="20"/>
-          <w:lang w:val="en-US"/>
-        </w:rPr>
-      </w:pPr>
-      <w:r>
-        <w:rPr>
-          <w:rFonts w:cs="Times New Roman"/>
-          <w:szCs w:val="20"/>
-          <w:lang w:val="en-US"/>
-        </w:rPr>
-        <w:t xml:space="preserve">CREATE OR REPLACE TRIGGER </w:t>
-      </w:r>
-      <w:proofErr w:type="spellStart"/>
-      <w:r>
-        <w:rPr>
-          <w:rFonts w:cs="Times New Roman"/>
-          <w:szCs w:val="20"/>
-          <w:lang w:val="en-US"/>
-        </w:rPr>
-        <w:t>SedutaAggiungiVotoSuTesiTrigger</w:t>
-      </w:r>
-      <w:proofErr w:type="spellEnd"/>
-    </w:p>
-    <w:p>
-      <w:pPr>
-        <w:ind w:left="0" w:right="192" w:firstLine="0"/>
-        <w:jc w:val="left"/>
-        <w:rPr>
-          <w:rFonts w:cs="Times New Roman"/>
-          <w:szCs w:val="20"/>
-          <w:lang w:val="en-US"/>
-        </w:rPr>
-      </w:pPr>
-      <w:r>
-        <w:rPr>
-          <w:rFonts w:cs="Times New Roman"/>
-          <w:szCs w:val="20"/>
-          <w:lang w:val="en-US"/>
-        </w:rPr>
-        <w:tab/>
-        <w:t>BEFORE UPDATE ON Tesi</w:t>
-      </w:r>
-    </w:p>
-    <w:p>
-      <w:pPr>
-        <w:ind w:left="0" w:right="192" w:firstLine="0"/>
-        <w:jc w:val="left"/>
-        <w:rPr>
-          <w:rFonts w:cs="Times New Roman"/>
-          <w:szCs w:val="20"/>
-          <w:lang w:val="en-US"/>
-        </w:rPr>
-      </w:pPr>
-      <w:r>
-        <w:rPr>
-          <w:rFonts w:cs="Times New Roman"/>
-          <w:szCs w:val="20"/>
-          <w:lang w:val="en-US"/>
-        </w:rPr>
-        <w:tab/>
-        <w:t>FOR EACH ROW</w:t>
-      </w:r>
-    </w:p>
-    <w:p>
-      <w:pPr>
-        <w:ind w:left="0" w:right="192" w:firstLine="0"/>
-        <w:jc w:val="left"/>
-        <w:rPr>
-          <w:rFonts w:cs="Times New Roman"/>
-          <w:szCs w:val="20"/>
-          <w:lang w:val="en-US"/>
-        </w:rPr>
-      </w:pPr>
-      <w:r>
-        <w:rPr>
-          <w:rFonts w:cs="Times New Roman"/>
-          <w:szCs w:val="20"/>
-          <w:lang w:val="en-US"/>
-        </w:rPr>
-        <w:t xml:space="preserve">EXECUTE FUNCTION </w:t>
-      </w:r>
-      <w:proofErr w:type="spellStart"/>
-      <w:proofErr w:type="gramStart"/>
-      <w:r>
-        <w:rPr>
-          <w:rFonts w:cs="Times New Roman"/>
-          <w:szCs w:val="20"/>
-          <w:lang w:val="en-US"/>
-        </w:rPr>
-        <w:t>Sedu</w:t>
-      </w:r>
-      <w:r>
-        <w:rPr>
-          <w:rFonts w:cs="Times New Roman"/>
-          <w:szCs w:val="20"/>
-          <w:lang w:val="en-US"/>
-        </w:rPr>
-        <w:t>t</w:t>
-      </w:r>
-      <w:r>
-        <w:rPr>
-          <w:rFonts w:cs="Times New Roman"/>
-          <w:szCs w:val="20"/>
-          <w:lang w:val="en-US"/>
-        </w:rPr>
-        <w:t>aAggiungiVotoSuTesi</w:t>
+        <w:t>SedutaControlloDataTirocinio</w:t>
       </w:r>
       <w:proofErr w:type="spellEnd"/>
       <w:r>

</xml_diff>